<commit_message>
Evidencias: HU-02, HU-05 y QA de HU-03 – llena las filas de Roy
Secciones 3.2 y 3.5 (con capturas), resultado de QA y captura de 3.3,
tabla de historias, commits, PR (#12, #13), pruebas y filas de Roy en
las secciones 6 a 9 (numeradas como en docs/AI_LOG.md).

Co-Authored-By: Claude Opus 5.5 <noreply@anthropic.com>
</commit_message>
<xml_diff>
--- a/docs/1GS242_Proyecto1_Evidencias_IA.docx
+++ b/docs/1GS242_Proyecto1_Evidencias_IA.docx
@@ -2117,13 +2117,12 @@
             </w:pPr>
             <w:r>
               <w:rPr>
-                <w:color w:val="7F7F7F"/>
-                <w:i/>
-                <w:iCs/>
-                <w:sz w:val="17"/>
-                <w:szCs w:val="17"/>
-              </w:rPr>
-              <w:t xml:space="preserve">[#]</w:t>
+                <w:i w:val="0"/>
+                <w:iCs/>
+                <w:sz w:val="17"/>
+                <w:szCs w:val="17"/>
+              </w:rPr>
+              <w:t>#2</w:t>
             </w:r>
           </w:p>
         </w:tc>
@@ -2138,13 +2137,12 @@
             </w:pPr>
             <w:r>
               <w:rPr>
-                <w:color w:val="7F7F7F"/>
-                <w:i/>
-                <w:iCs/>
-                <w:sz w:val="17"/>
-                <w:szCs w:val="17"/>
-              </w:rPr>
-              <w:t xml:space="preserve">[rama]</w:t>
+                <w:i w:val="0"/>
+                <w:iCs/>
+                <w:sz w:val="17"/>
+                <w:szCs w:val="17"/>
+              </w:rPr>
+              <w:t>feature/hu-02-calendario</w:t>
             </w:r>
           </w:p>
         </w:tc>
@@ -2159,13 +2157,12 @@
             </w:pPr>
             <w:r>
               <w:rPr>
-                <w:color w:val="7F7F7F"/>
-                <w:i/>
-                <w:iCs/>
-                <w:sz w:val="17"/>
-                <w:szCs w:val="17"/>
-              </w:rPr>
-              <w:t xml:space="preserve">[#]</w:t>
+                <w:i w:val="0"/>
+                <w:iCs/>
+                <w:sz w:val="17"/>
+                <w:szCs w:val="17"/>
+              </w:rPr>
+              <w:t>#12</w:t>
             </w:r>
           </w:p>
         </w:tc>
@@ -2180,13 +2177,12 @@
             </w:pPr>
             <w:r>
               <w:rPr>
-                <w:color w:val="7F7F7F"/>
-                <w:i/>
-                <w:iCs/>
-                <w:sz w:val="17"/>
-                <w:szCs w:val="17"/>
-              </w:rPr>
-              <w:t xml:space="preserve">[ ]</w:t>
+                <w:i w:val="0"/>
+                <w:iCs/>
+                <w:sz w:val="17"/>
+                <w:szCs w:val="17"/>
+              </w:rPr>
+              <w:t>En revisión (Reviewer: Einer · QA: Kelvin)</w:t>
             </w:r>
           </w:p>
         </w:tc>
@@ -2486,13 +2482,12 @@
             </w:pPr>
             <w:r>
               <w:rPr>
-                <w:color w:val="7F7F7F"/>
-                <w:i/>
-                <w:iCs/>
-                <w:sz w:val="17"/>
-                <w:szCs w:val="17"/>
-              </w:rPr>
-              <w:t xml:space="preserve">[Pendiente: Como … quiero … para …]</w:t>
+                <w:i w:val="0"/>
+                <w:iCs/>
+                <w:sz w:val="17"/>
+                <w:szCs w:val="17"/>
+              </w:rPr>
+              <w:t>Como administrador, quiero exportar las reservas a CSV, para llevar el control en una hoja de cálculo.</w:t>
             </w:r>
           </w:p>
         </w:tc>
@@ -2507,13 +2502,12 @@
             </w:pPr>
             <w:r>
               <w:rPr>
-                <w:color w:val="7F7F7F"/>
-                <w:i/>
-                <w:iCs/>
-                <w:sz w:val="17"/>
-                <w:szCs w:val="17"/>
-              </w:rPr>
-              <w:t xml:space="preserve">[#]</w:t>
+                <w:i w:val="0"/>
+                <w:iCs/>
+                <w:sz w:val="17"/>
+                <w:szCs w:val="17"/>
+              </w:rPr>
+              <w:t>#5</w:t>
             </w:r>
           </w:p>
         </w:tc>
@@ -2528,13 +2522,12 @@
             </w:pPr>
             <w:r>
               <w:rPr>
-                <w:color w:val="7F7F7F"/>
-                <w:i/>
-                <w:iCs/>
-                <w:sz w:val="17"/>
-                <w:szCs w:val="17"/>
-              </w:rPr>
-              <w:t xml:space="preserve">[rama]</w:t>
+                <w:i w:val="0"/>
+                <w:iCs/>
+                <w:sz w:val="17"/>
+                <w:szCs w:val="17"/>
+              </w:rPr>
+              <w:t>feature/hu-05-exportar-csv</w:t>
             </w:r>
           </w:p>
         </w:tc>
@@ -2549,13 +2542,12 @@
             </w:pPr>
             <w:r>
               <w:rPr>
-                <w:color w:val="7F7F7F"/>
-                <w:i/>
-                <w:iCs/>
-                <w:sz w:val="17"/>
-                <w:szCs w:val="17"/>
-              </w:rPr>
-              <w:t xml:space="preserve">[#]</w:t>
+                <w:i w:val="0"/>
+                <w:iCs/>
+                <w:sz w:val="17"/>
+                <w:szCs w:val="17"/>
+              </w:rPr>
+              <w:t>#13</w:t>
             </w:r>
           </w:p>
         </w:tc>
@@ -2570,13 +2562,12 @@
             </w:pPr>
             <w:r>
               <w:rPr>
-                <w:color w:val="7F7F7F"/>
-                <w:i/>
-                <w:iCs/>
-                <w:sz w:val="17"/>
-                <w:szCs w:val="17"/>
-              </w:rPr>
-              <w:t xml:space="preserve">[ ]</w:t>
+                <w:i w:val="0"/>
+                <w:iCs/>
+                <w:sz w:val="17"/>
+                <w:szCs w:val="17"/>
+              </w:rPr>
+              <w:t>En revisión (Reviewer: Einer · QA: Kelvin)</w:t>
             </w:r>
           </w:p>
         </w:tc>
@@ -2935,13 +2926,12 @@
             </w:pPr>
             <w:r>
               <w:rPr>
-                <w:color w:val="7F7F7F"/>
-                <w:i/>
-                <w:iCs/>
-                <w:sz w:val="17"/>
-                <w:szCs w:val="17"/>
-              </w:rPr>
-              <w:t xml:space="preserve">[Pendiente]</w:t>
+                <w:i w:val="0"/>
+                <w:iCs/>
+                <w:sz w:val="17"/>
+                <w:szCs w:val="17"/>
+              </w:rPr>
+              <w:t>El cliente ve un calendario mensual con los días disponibles, ocupados y cerrados/pasados del servicio elegido. Al tocar un día disponible ve sus horarios libres, sin intentos fallidos.</w:t>
             </w:r>
           </w:p>
         </w:tc>
@@ -2982,13 +2972,12 @@
             </w:pPr>
             <w:r>
               <w:rPr>
-                <w:color w:val="7F7F7F"/>
-                <w:i/>
-                <w:iCs/>
-                <w:sz w:val="17"/>
-                <w:szCs w:val="17"/>
-              </w:rPr>
-              <w:t xml:space="preserve">[Pendiente]</w:t>
+                <w:i w:val="0"/>
+                <w:iCs/>
+                <w:sz w:val="17"/>
+                <w:szCs w:val="17"/>
+              </w:rPr>
+              <w:t>1) Endpoint GET /api/availability/month?service_id=&amp;month=YYYY-MM que reutiliza availability.py. 2) Calendario con días disponibles (verde), ocupados (rojo, tachado) y cerrados/pasados (gris) distinguibles. 3) Elegir un día disponible muestra sus horarios libres. 4) Pruebas automatizadas nuevas pasando. 5) Captura y registro en docs/AI_LOG.md.</w:t>
             </w:r>
           </w:p>
         </w:tc>
@@ -3029,13 +3018,12 @@
             </w:pPr>
             <w:r>
               <w:rPr>
-                <w:color w:val="7F7F7F"/>
-                <w:i/>
-                <w:iCs/>
-                <w:sz w:val="17"/>
-                <w:szCs w:val="17"/>
-              </w:rPr>
-              <w:t xml:space="preserve">[Pendiente]</w:t>
+                <w:i w:val="0"/>
+                <w:iCs/>
+                <w:sz w:val="17"/>
+                <w:szCs w:val="17"/>
+              </w:rPr>
+              <w:t>Claude Code (Claude Opus 5.5) analizó availability.py, routers/public.py, index.html y las ramas abiertas antes de programar. Propuso reutilizar generate_slots día por día (así el calendario y la lista de horarios nunca se contradicen) e implementó el endpoint, el calendario y 14 pruebas. A mano se corrigieron 2 errores visuales de la IA (título «Octubre De 2026» por text-transform: capitalize, y celdas desalineadas con los encabezados) y se rechazó tocar los mismos imports que HU-04 porque provocaba conflicto de merge. También corrige el bug de la fecha mínima en UTC que HU-01 dejó anotado.</w:t>
             </w:r>
           </w:p>
         </w:tc>
@@ -3076,13 +3064,12 @@
             </w:pPr>
             <w:r>
               <w:rPr>
-                <w:color w:val="7F7F7F"/>
-                <w:i/>
-                <w:iCs/>
-                <w:sz w:val="17"/>
-                <w:szCs w:val="17"/>
-              </w:rPr>
-              <w:t xml:space="preserve">[Pendiente]</w:t>
+                <w:i w:val="0"/>
+                <w:iCs/>
+                <w:sz w:val="17"/>
+                <w:szCs w:val="17"/>
+              </w:rPr>
+              <w:t>pytest: 20 passed (6 originales + 14 nuevas: mes completo, domingos cerrados, conteo igual a /api/availability, día lleno, cita cancelada que no bloquea, días pasados, febrero bisiesto, formatos de mes inválidos → 422 y servicio inexistente o inactivo → 404). Pre-chequeo del Developer en navegador con Playwright: estados del mes, clic en día lleno, navegación de meses, cambio de servicio y vista móvil. Integración con todas las ramas abiertas: 62 passed. Validación manual de QA: Kelvin (PR #12).</w:t>
             </w:r>
           </w:p>
         </w:tc>
@@ -3123,16 +3110,53 @@
           <w:p>
             <w:pPr>
               <w:spacing w:after="40" w:line="252" w:lineRule="auto"/>
-            </w:pPr>
-            <w:r>
-              <w:rPr>
-                <w:color w:val="7F7F7F"/>
-                <w:i/>
-                <w:iCs/>
-                <w:sz w:val="17"/>
-                <w:szCs w:val="17"/>
-              </w:rPr>
-              <w:t xml:space="preserve">[Insertar captura: funcionalidad en ejecución]</w:t>
+              <w:jc w:val="center"/>
+            </w:pPr>
+            <w:r>
+              <w:drawing>
+                <wp:inline xmlns:a="http://schemas.openxmlformats.org/drawingml/2006/main" xmlns:pic="http://schemas.openxmlformats.org/drawingml/2006/picture">
+                  <wp:extent cx="3960000" cy="3128196"/>
+                  <wp:docPr id="1503634245" name="Picture 1503634245"/>
+                  <wp:cNvGraphicFramePr>
+                    <a:graphicFrameLocks noChangeAspect="1"/>
+                  </wp:cNvGraphicFramePr>
+                  <a:graphic>
+                    <a:graphicData uri="http://schemas.openxmlformats.org/drawingml/2006/picture">
+                      <pic:pic>
+                        <pic:nvPicPr>
+                          <pic:cNvPr id="0" name="HU-02_calendario.png"/>
+                          <pic:cNvPicPr/>
+                        </pic:nvPicPr>
+                        <pic:blipFill>
+                          <a:blip r:embed="rId18"/>
+                          <a:stretch>
+                            <a:fillRect/>
+                          </a:stretch>
+                        </pic:blipFill>
+                        <pic:spPr>
+                          <a:xfrm>
+                            <a:off x="0" y="0"/>
+                            <a:ext cx="3960000" cy="3128196"/>
+                          </a:xfrm>
+                          <a:prstGeom prst="rect"/>
+                        </pic:spPr>
+                      </pic:pic>
+                    </a:graphicData>
+                  </a:graphic>
+                </wp:inline>
+              </w:drawing>
+            </w:r>
+          </w:p>
+          <w:p>
+            <w:pPr>
+              <w:jc w:val="center"/>
+            </w:pPr>
+            <w:r>
+              <w:rPr>
+                <w:i/>
+                <w:sz w:val="17"/>
+              </w:rPr>
+              <w:t>HU-02: calendario de octubre de 2026. Días 28, 29 y 31 disponibles, 30 ocupado y días pasados en gris; al elegir el 28 se muestran sus horarios libres.</w:t>
             </w:r>
           </w:p>
         </w:tc>
@@ -3354,13 +3378,12 @@
             </w:pPr>
             <w:r>
               <w:rPr>
-                <w:color w:val="7F7F7F"/>
-                <w:i/>
-                <w:iCs/>
-                <w:sz w:val="17"/>
-                <w:szCs w:val="17"/>
-              </w:rPr>
-              <w:t xml:space="preserve">[Pendiente]</w:t>
+                <w:i w:val="0"/>
+                <w:iCs/>
+                <w:sz w:val="17"/>
+                <w:szCs w:val="17"/>
+              </w:rPr>
+              <w:t>QA (Roy, 28/10): pytest 13 passed en la rama del PR #10 (20 con el histórico de seed.py --historico del PR #11; 62 con todas las ramas integradas). API: sin token → 422, token incorrecto → 401, parámetros fuera de rango → 422, límites válidos → 200. Datos: 334 reservas = suma diaria = suma semanal = suma por servicio; el pronóstico es el promedio por día de la semana (~83.5 reservas en 14 días). Navegador (escritorio y móvil): los 4 gráficos se cargan sin errores. Observaciones no bloqueantes en el PR #10: el día de hoy cuenta como día completo, semanas parciales, etiqueta partida en dos líneas y barras muy finas en móvil.</w:t>
             </w:r>
           </w:p>
         </w:tc>
@@ -3401,16 +3424,53 @@
           <w:p>
             <w:pPr>
               <w:spacing w:after="40" w:line="252" w:lineRule="auto"/>
-            </w:pPr>
-            <w:r>
-              <w:rPr>
-                <w:color w:val="7F7F7F"/>
-                <w:i/>
-                <w:iCs/>
-                <w:sz w:val="17"/>
-                <w:szCs w:val="17"/>
-              </w:rPr>
-              <w:t xml:space="preserve">[Insertar captura: funcionalidad en ejecución]</w:t>
+              <w:jc w:val="center"/>
+            </w:pPr>
+            <w:r>
+              <w:drawing>
+                <wp:inline xmlns:a="http://schemas.openxmlformats.org/drawingml/2006/main" xmlns:pic="http://schemas.openxmlformats.org/drawingml/2006/picture">
+                  <wp:extent cx="5040000" cy="4066364"/>
+                  <wp:docPr id="1503634246" name="Picture 1503634246"/>
+                  <wp:cNvGraphicFramePr>
+                    <a:graphicFrameLocks noChangeAspect="1"/>
+                  </wp:cNvGraphicFramePr>
+                  <a:graphic>
+                    <a:graphicData uri="http://schemas.openxmlformats.org/drawingml/2006/picture">
+                      <pic:pic>
+                        <pic:nvPicPr>
+                          <pic:cNvPr id="0" name="HU-03_QA_prevision.png"/>
+                          <pic:cNvPicPr/>
+                        </pic:nvPicPr>
+                        <pic:blipFill>
+                          <a:blip r:embed="rId19"/>
+                          <a:stretch>
+                            <a:fillRect/>
+                          </a:stretch>
+                        </pic:blipFill>
+                        <pic:spPr>
+                          <a:xfrm>
+                            <a:off x="0" y="0"/>
+                            <a:ext cx="5040000" cy="4066364"/>
+                          </a:xfrm>
+                          <a:prstGeom prst="rect"/>
+                        </pic:spPr>
+                      </pic:pic>
+                    </a:graphicData>
+                  </a:graphic>
+                </wp:inline>
+              </w:drawing>
+            </w:r>
+          </w:p>
+          <w:p>
+            <w:pPr>
+              <w:jc w:val="center"/>
+            </w:pPr>
+            <w:r>
+              <w:rPr>
+                <w:i/>
+                <w:sz w:val="17"/>
+              </w:rPr>
+              <w:t>HU-03 (QA): previsión de la demanda en el panel admin con el histórico de ejemplo (56 días + 14 de pronóstico).</w:t>
             </w:r>
           </w:p>
         </w:tc>
@@ -3707,7 +3767,7 @@
         <w:spacing w:before="240" w:after="120"/>
       </w:pPr>
       <w:r>
-        <w:t xml:space="preserve">3.5 HU-05: [título]</w:t>
+        <w:t>3.5 HU-05: Exportar reservas a CSV</w:t>
       </w:r>
     </w:p>
     <w:tbl>
@@ -3769,13 +3829,12 @@
             </w:pPr>
             <w:r>
               <w:rPr>
-                <w:color w:val="7F7F7F"/>
-                <w:i/>
-                <w:iCs/>
-                <w:sz w:val="17"/>
-                <w:szCs w:val="17"/>
-              </w:rPr>
-              <w:t xml:space="preserve">[Pendiente]</w:t>
+                <w:i w:val="0"/>
+                <w:iCs/>
+                <w:sz w:val="17"/>
+                <w:szCs w:val="17"/>
+              </w:rPr>
+              <w:t>El administrador descarga desde el panel un archivo CSV con las reservas, con los mismos filtros de fecha y estado que muestra la tabla, y lo abre en Excel o Google Sheets con tildes y eñes correctas.</w:t>
             </w:r>
           </w:p>
         </w:tc>
@@ -3816,13 +3875,12 @@
             </w:pPr>
             <w:r>
               <w:rPr>
-                <w:color w:val="7F7F7F"/>
-                <w:i/>
-                <w:iCs/>
-                <w:sz w:val="17"/>
-                <w:szCs w:val="17"/>
-              </w:rPr>
-              <w:t xml:space="preserve">[Pendiente]</w:t>
+                <w:i w:val="0"/>
+                <w:iCs/>
+                <w:sz w:val="17"/>
+                <w:szCs w:val="17"/>
+              </w:rPr>
+              <w:t>1) Endpoint admin GET /api/admin/appointments/export con filtros por estado y rango de fechas, protegido con X-Admin-Token. 2) Botón «Exportar CSV» en admin.html. 3) Pruebas automatizadas nuevas pasando. 4) Captura y registro en docs/AI_LOG.md.</w:t>
             </w:r>
           </w:p>
         </w:tc>
@@ -3863,13 +3921,12 @@
             </w:pPr>
             <w:r>
               <w:rPr>
-                <w:color w:val="7F7F7F"/>
-                <w:i/>
-                <w:iCs/>
-                <w:sz w:val="17"/>
-                <w:szCs w:val="17"/>
-              </w:rPr>
-              <w:t xml:space="preserve">[Pendiente]</w:t>
+                <w:i w:val="0"/>
+                <w:iCs/>
+                <w:sz w:val="17"/>
+                <w:szCs w:val="17"/>
+              </w:rPr>
+              <w:t>Claude Code (Claude Opus 5.5) analizó crud.py, routers/admin.py y admin.html; propuso ampliar list_appointments con date_from/date_to sin romper el filtro del panel y un módulo export.py aparte. Implementó el CSV con BOM UTF-8, estados en español, neutralización de fórmulas (= + - @) en el texto que escribe el cliente y la descarga con fetch + Blob (el endpoint exige el token). Quedan para confirmar con el Reviewer: separador coma, el botón exporta lo que muestra la tabla y «precio» es el precio actual del servicio (la cita no lo guarda).</w:t>
             </w:r>
           </w:p>
         </w:tc>
@@ -3910,13 +3967,12 @@
             </w:pPr>
             <w:r>
               <w:rPr>
-                <w:color w:val="7F7F7F"/>
-                <w:i/>
-                <w:iCs/>
-                <w:sz w:val="17"/>
-                <w:szCs w:val="17"/>
-              </w:rPr>
-              <w:t xml:space="preserve">[Pendiente]</w:t>
+                <w:i w:val="0"/>
+                <w:iCs/>
+                <w:sz w:val="17"/>
+                <w:szCs w:val="17"/>
+              </w:rPr>
+              <w:t>pytest: 16 passed (6 originales + 10 nuevas: token, cabeceras de descarga y BOM, CSV vacío, contenido con tildes, orden por fecha, filtro por estado, rango inclusivo, neutralización de fórmulas, filtros inválidos → 422 y regresión del filtro del panel). Pre-chequeo en navegador con Playwright: el CSV tiene las mismas filas que la tabla, con y sin filtro. Integración con todas las ramas abiertas: 62 passed. Validación manual de QA: Kelvin (PR #13).</w:t>
             </w:r>
           </w:p>
         </w:tc>
@@ -3957,16 +4013,53 @@
           <w:p>
             <w:pPr>
               <w:spacing w:after="40" w:line="252" w:lineRule="auto"/>
-            </w:pPr>
-            <w:r>
-              <w:rPr>
-                <w:color w:val="7F7F7F"/>
-                <w:i/>
-                <w:iCs/>
-                <w:sz w:val="17"/>
-                <w:szCs w:val="17"/>
-              </w:rPr>
-              <w:t xml:space="preserve">[Insertar captura: funcionalidad en ejecución]</w:t>
+              <w:jc w:val="center"/>
+            </w:pPr>
+            <w:r>
+              <w:drawing>
+                <wp:inline xmlns:a="http://schemas.openxmlformats.org/drawingml/2006/main" xmlns:pic="http://schemas.openxmlformats.org/drawingml/2006/picture">
+                  <wp:extent cx="5040000" cy="1913864"/>
+                  <wp:docPr id="1503634247" name="Picture 1503634247"/>
+                  <wp:cNvGraphicFramePr>
+                    <a:graphicFrameLocks noChangeAspect="1"/>
+                  </wp:cNvGraphicFramePr>
+                  <a:graphic>
+                    <a:graphicData uri="http://schemas.openxmlformats.org/drawingml/2006/picture">
+                      <pic:pic>
+                        <pic:nvPicPr>
+                          <pic:cNvPr id="0" name="HU-05_exportar-csv.png"/>
+                          <pic:cNvPicPr/>
+                        </pic:nvPicPr>
+                        <pic:blipFill>
+                          <a:blip r:embed="rId20"/>
+                          <a:stretch>
+                            <a:fillRect/>
+                          </a:stretch>
+                        </pic:blipFill>
+                        <pic:spPr>
+                          <a:xfrm>
+                            <a:off x="0" y="0"/>
+                            <a:ext cx="5040000" cy="1913864"/>
+                          </a:xfrm>
+                          <a:prstGeom prst="rect"/>
+                        </pic:spPr>
+                      </pic:pic>
+                    </a:graphicData>
+                  </a:graphic>
+                </wp:inline>
+              </w:drawing>
+            </w:r>
+          </w:p>
+          <w:p>
+            <w:pPr>
+              <w:jc w:val="center"/>
+            </w:pPr>
+            <w:r>
+              <w:rPr>
+                <w:i/>
+                <w:sz w:val="17"/>
+              </w:rPr>
+              <w:t>HU-05: botón «Exportar CSV» en el panel de reservas; descarga lo que muestra la tabla con los filtros actuales.</w:t>
             </w:r>
           </w:p>
         </w:tc>
@@ -4395,13 +4488,12 @@
             </w:pPr>
             <w:r>
               <w:rPr>
-                <w:color w:val="7F7F7F"/>
-                <w:i/>
-                <w:iCs/>
-                <w:sz w:val="17"/>
-                <w:szCs w:val="17"/>
-              </w:rPr>
-              <w:t xml:space="preserve">[hash]</w:t>
+                <w:i w:val="0"/>
+                <w:iCs/>
+                <w:sz w:val="17"/>
+                <w:szCs w:val="17"/>
+              </w:rPr>
+              <w:t>36e41f6</w:t>
             </w:r>
           </w:p>
         </w:tc>
@@ -4416,13 +4508,12 @@
             </w:pPr>
             <w:r>
               <w:rPr>
-                <w:color w:val="7F7F7F"/>
-                <w:i/>
-                <w:iCs/>
-                <w:sz w:val="17"/>
-                <w:szCs w:val="17"/>
-              </w:rPr>
-              <w:t xml:space="preserve">[autor]</w:t>
+                <w:i w:val="0"/>
+                <w:iCs/>
+                <w:sz w:val="17"/>
+                <w:szCs w:val="17"/>
+              </w:rPr>
+              <w:t>Roy Barrera (Roy-x24)</w:t>
             </w:r>
           </w:p>
         </w:tc>
@@ -4437,13 +4528,12 @@
             </w:pPr>
             <w:r>
               <w:rPr>
-                <w:color w:val="7F7F7F"/>
-                <w:i/>
-                <w:iCs/>
-                <w:sz w:val="17"/>
-                <w:szCs w:val="17"/>
-              </w:rPr>
-              <w:t xml:space="preserve">[mensaje que referencia el issue]</w:t>
+                <w:i w:val="0"/>
+                <w:iCs/>
+                <w:sz w:val="17"/>
+                <w:szCs w:val="17"/>
+              </w:rPr>
+              <w:t>HU-02: agrega endpoint de disponibilidad mensual</w:t>
             </w:r>
           </w:p>
         </w:tc>
@@ -4458,13 +4548,12 @@
             </w:pPr>
             <w:r>
               <w:rPr>
-                <w:color w:val="7F7F7F"/>
-                <w:i/>
-                <w:iCs/>
-                <w:sz w:val="17"/>
-                <w:szCs w:val="17"/>
-              </w:rPr>
-              <w:t xml:space="preserve">[HU-0X]</w:t>
+                <w:i w:val="0"/>
+                <w:iCs/>
+                <w:sz w:val="17"/>
+                <w:szCs w:val="17"/>
+              </w:rPr>
+              <w:t>HU-02</w:t>
             </w:r>
           </w:p>
         </w:tc>
@@ -4484,13 +4573,12 @@
             </w:pPr>
             <w:r>
               <w:rPr>
-                <w:color w:val="7F7F7F"/>
-                <w:i/>
-                <w:iCs/>
-                <w:sz w:val="17"/>
-                <w:szCs w:val="17"/>
-              </w:rPr>
-              <w:t xml:space="preserve">[hash]</w:t>
+                <w:i w:val="0"/>
+                <w:iCs/>
+                <w:sz w:val="17"/>
+                <w:szCs w:val="17"/>
+              </w:rPr>
+              <w:t>af952c9</w:t>
             </w:r>
           </w:p>
         </w:tc>
@@ -4505,13 +4593,12 @@
             </w:pPr>
             <w:r>
               <w:rPr>
-                <w:color w:val="7F7F7F"/>
-                <w:i/>
-                <w:iCs/>
-                <w:sz w:val="17"/>
-                <w:szCs w:val="17"/>
-              </w:rPr>
-              <w:t xml:space="preserve">[autor]</w:t>
+                <w:i w:val="0"/>
+                <w:iCs/>
+                <w:sz w:val="17"/>
+                <w:szCs w:val="17"/>
+              </w:rPr>
+              <w:t>Roy Barrera (Roy-x24)</w:t>
             </w:r>
           </w:p>
         </w:tc>
@@ -4526,13 +4613,12 @@
             </w:pPr>
             <w:r>
               <w:rPr>
-                <w:color w:val="7F7F7F"/>
-                <w:i/>
-                <w:iCs/>
-                <w:sz w:val="17"/>
-                <w:szCs w:val="17"/>
-              </w:rPr>
-              <w:t xml:space="preserve">[mensaje que referencia el issue]</w:t>
+                <w:i w:val="0"/>
+                <w:iCs/>
+                <w:sz w:val="17"/>
+                <w:szCs w:val="17"/>
+              </w:rPr>
+              <w:t>HU-05: agrega endpoint admin para exportar reservas a CSV</w:t>
             </w:r>
           </w:p>
         </w:tc>
@@ -4547,13 +4633,12 @@
             </w:pPr>
             <w:r>
               <w:rPr>
-                <w:color w:val="7F7F7F"/>
-                <w:i/>
-                <w:iCs/>
-                <w:sz w:val="17"/>
-                <w:szCs w:val="17"/>
-              </w:rPr>
-              <w:t xml:space="preserve">[HU-0X]</w:t>
+                <w:i w:val="0"/>
+                <w:iCs/>
+                <w:sz w:val="17"/>
+                <w:szCs w:val="17"/>
+              </w:rPr>
+              <w:t>HU-05</w:t>
             </w:r>
           </w:p>
         </w:tc>
@@ -5020,13 +5105,12 @@
             </w:pPr>
             <w:r>
               <w:rPr>
-                <w:color w:val="7F7F7F"/>
-                <w:i/>
-                <w:iCs/>
-                <w:sz w:val="17"/>
-                <w:szCs w:val="17"/>
-              </w:rPr>
-              <w:t xml:space="preserve">[#]</w:t>
+                <w:i w:val="0"/>
+                <w:iCs/>
+                <w:sz w:val="17"/>
+                <w:szCs w:val="17"/>
+              </w:rPr>
+              <w:t>#12</w:t>
             </w:r>
           </w:p>
         </w:tc>
@@ -5041,13 +5125,12 @@
             </w:pPr>
             <w:r>
               <w:rPr>
-                <w:color w:val="7F7F7F"/>
-                <w:i/>
-                <w:iCs/>
-                <w:sz w:val="17"/>
-                <w:szCs w:val="17"/>
-              </w:rPr>
-              <w:t xml:space="preserve">[Pendiente]</w:t>
+                <w:i w:val="0"/>
+                <w:iCs/>
+                <w:sz w:val="17"/>
+                <w:szCs w:val="17"/>
+              </w:rPr>
+              <w:t>HU-02: Calendario dinámico de disponibilidad</w:t>
             </w:r>
           </w:p>
         </w:tc>
@@ -5062,13 +5145,12 @@
             </w:pPr>
             <w:r>
               <w:rPr>
-                <w:color w:val="7F7F7F"/>
-                <w:i/>
-                <w:iCs/>
-                <w:sz w:val="17"/>
-                <w:szCs w:val="17"/>
-              </w:rPr>
-              <w:t xml:space="preserve">[Pendiente]</w:t>
+                <w:i w:val="0"/>
+                <w:iCs/>
+                <w:sz w:val="17"/>
+                <w:szCs w:val="17"/>
+              </w:rPr>
+              <w:t>Roy</w:t>
             </w:r>
           </w:p>
         </w:tc>
@@ -5083,13 +5165,12 @@
             </w:pPr>
             <w:r>
               <w:rPr>
-                <w:color w:val="7F7F7F"/>
-                <w:i/>
-                <w:iCs/>
-                <w:sz w:val="17"/>
-                <w:szCs w:val="17"/>
-              </w:rPr>
-              <w:t xml:space="preserve">[Pendiente]</w:t>
+                <w:i w:val="0"/>
+                <w:iCs/>
+                <w:sz w:val="17"/>
+                <w:szCs w:val="17"/>
+              </w:rPr>
+              <w:t>Einer</w:t>
             </w:r>
           </w:p>
         </w:tc>
@@ -5104,13 +5185,12 @@
             </w:pPr>
             <w:r>
               <w:rPr>
-                <w:color w:val="7F7F7F"/>
-                <w:i/>
-                <w:iCs/>
-                <w:sz w:val="17"/>
-                <w:szCs w:val="17"/>
-              </w:rPr>
-              <w:t xml:space="preserve">[Pendiente]</w:t>
+                <w:i w:val="0"/>
+                <w:iCs/>
+                <w:sz w:val="17"/>
+                <w:szCs w:val="17"/>
+              </w:rPr>
+              <w:t>Abierto, en revisión</w:t>
             </w:r>
           </w:p>
         </w:tc>
@@ -5130,13 +5210,12 @@
             </w:pPr>
             <w:r>
               <w:rPr>
-                <w:color w:val="7F7F7F"/>
-                <w:i/>
-                <w:iCs/>
-                <w:sz w:val="17"/>
-                <w:szCs w:val="17"/>
-              </w:rPr>
-              <w:t xml:space="preserve">[#]</w:t>
+                <w:i w:val="0"/>
+                <w:iCs/>
+                <w:sz w:val="17"/>
+                <w:szCs w:val="17"/>
+              </w:rPr>
+              <w:t>#13</w:t>
             </w:r>
           </w:p>
         </w:tc>
@@ -5151,13 +5230,12 @@
             </w:pPr>
             <w:r>
               <w:rPr>
-                <w:color w:val="7F7F7F"/>
-                <w:i/>
-                <w:iCs/>
-                <w:sz w:val="17"/>
-                <w:szCs w:val="17"/>
-              </w:rPr>
-              <w:t xml:space="preserve">[Pendiente]</w:t>
+                <w:i w:val="0"/>
+                <w:iCs/>
+                <w:sz w:val="17"/>
+                <w:szCs w:val="17"/>
+              </w:rPr>
+              <w:t>HU-05: Exportar reservas a CSV</w:t>
             </w:r>
           </w:p>
         </w:tc>
@@ -5172,13 +5250,12 @@
             </w:pPr>
             <w:r>
               <w:rPr>
-                <w:color w:val="7F7F7F"/>
-                <w:i/>
-                <w:iCs/>
-                <w:sz w:val="17"/>
-                <w:szCs w:val="17"/>
-              </w:rPr>
-              <w:t xml:space="preserve">[Pendiente]</w:t>
+                <w:i w:val="0"/>
+                <w:iCs/>
+                <w:sz w:val="17"/>
+                <w:szCs w:val="17"/>
+              </w:rPr>
+              <w:t>Roy</w:t>
             </w:r>
           </w:p>
         </w:tc>
@@ -5193,13 +5270,12 @@
             </w:pPr>
             <w:r>
               <w:rPr>
-                <w:color w:val="7F7F7F"/>
-                <w:i/>
-                <w:iCs/>
-                <w:sz w:val="17"/>
-                <w:szCs w:val="17"/>
-              </w:rPr>
-              <w:t xml:space="preserve">[Pendiente]</w:t>
+                <w:i w:val="0"/>
+                <w:iCs/>
+                <w:sz w:val="17"/>
+                <w:szCs w:val="17"/>
+              </w:rPr>
+              <w:t>Einer</w:t>
             </w:r>
           </w:p>
         </w:tc>
@@ -5214,13 +5290,12 @@
             </w:pPr>
             <w:r>
               <w:rPr>
-                <w:color w:val="7F7F7F"/>
-                <w:i/>
-                <w:iCs/>
-                <w:sz w:val="17"/>
-                <w:szCs w:val="17"/>
-              </w:rPr>
-              <w:t xml:space="preserve">[Pendiente]</w:t>
+                <w:i w:val="0"/>
+                <w:iCs/>
+                <w:sz w:val="17"/>
+                <w:szCs w:val="17"/>
+              </w:rPr>
+              <w:t>Abierto, en revisión</w:t>
             </w:r>
           </w:p>
         </w:tc>
@@ -5557,10 +5632,11 @@
               <w:rPr>
                 <w:b/>
                 <w:bCs/>
-                <w:sz w:val="17"/>
-                <w:szCs w:val="17"/>
-              </w:rPr>
-              <w:t xml:space="preserve">HU-02</w:t>
+                <w:i w:val="0"/>
+                <w:sz w:val="17"/>
+                <w:szCs w:val="17"/>
+              </w:rPr>
+              <w:t>HU-02</w:t>
             </w:r>
           </w:p>
         </w:tc>
@@ -5575,13 +5651,12 @@
             </w:pPr>
             <w:r>
               <w:rPr>
-                <w:color w:val="7F7F7F"/>
-                <w:i/>
-                <w:iCs/>
-                <w:sz w:val="17"/>
-                <w:szCs w:val="17"/>
-              </w:rPr>
-              <w:t xml:space="preserve">[unitaria/integración]</w:t>
+                <w:i w:val="0"/>
+                <w:iCs/>
+                <w:sz w:val="17"/>
+                <w:szCs w:val="17"/>
+              </w:rPr>
+              <w:t>Unitaria + integración (API)</w:t>
             </w:r>
           </w:p>
         </w:tc>
@@ -5596,13 +5671,12 @@
             </w:pPr>
             <w:r>
               <w:rPr>
-                <w:color w:val="7F7F7F"/>
-                <w:i/>
-                <w:iCs/>
-                <w:sz w:val="17"/>
-                <w:szCs w:val="17"/>
-              </w:rPr>
-              <w:t xml:space="preserve">[herramienta]</w:t>
+                <w:i w:val="0"/>
+                <w:iCs/>
+                <w:sz w:val="17"/>
+                <w:szCs w:val="17"/>
+              </w:rPr>
+              <w:t>pytest + FastAPI TestClient</w:t>
             </w:r>
           </w:p>
         </w:tc>
@@ -5617,13 +5691,12 @@
             </w:pPr>
             <w:r>
               <w:rPr>
-                <w:color w:val="7F7F7F"/>
-                <w:i/>
-                <w:iCs/>
-                <w:sz w:val="17"/>
-                <w:szCs w:val="17"/>
-              </w:rPr>
-              <w:t xml:space="preserve">[ ]</w:t>
+                <w:i w:val="0"/>
+                <w:iCs/>
+                <w:sz w:val="17"/>
+                <w:szCs w:val="17"/>
+              </w:rPr>
+              <w:t>14</w:t>
             </w:r>
           </w:p>
         </w:tc>
@@ -5638,13 +5711,12 @@
             </w:pPr>
             <w:r>
               <w:rPr>
-                <w:color w:val="7F7F7F"/>
-                <w:i/>
-                <w:iCs/>
-                <w:sz w:val="17"/>
-                <w:szCs w:val="17"/>
-              </w:rPr>
-              <w:t xml:space="preserve">[Pendiente]</w:t>
+                <w:i w:val="0"/>
+                <w:iCs/>
+                <w:sz w:val="17"/>
+                <w:szCs w:val="17"/>
+              </w:rPr>
+              <w:t>20/20 passed</w:t>
             </w:r>
           </w:p>
         </w:tc>
@@ -5887,10 +5959,11 @@
               <w:rPr>
                 <w:b/>
                 <w:bCs/>
-                <w:sz w:val="17"/>
-                <w:szCs w:val="17"/>
-              </w:rPr>
-              <w:t xml:space="preserve">HU-05</w:t>
+                <w:i w:val="0"/>
+                <w:sz w:val="17"/>
+                <w:szCs w:val="17"/>
+              </w:rPr>
+              <w:t>HU-05</w:t>
             </w:r>
           </w:p>
         </w:tc>
@@ -5905,13 +5978,12 @@
             </w:pPr>
             <w:r>
               <w:rPr>
-                <w:color w:val="7F7F7F"/>
-                <w:i/>
-                <w:iCs/>
-                <w:sz w:val="17"/>
-                <w:szCs w:val="17"/>
-              </w:rPr>
-              <w:t xml:space="preserve">[unitaria/integración]</w:t>
+                <w:i w:val="0"/>
+                <w:iCs/>
+                <w:sz w:val="17"/>
+                <w:szCs w:val="17"/>
+              </w:rPr>
+              <w:t>Unitaria + integración (API)</w:t>
             </w:r>
           </w:p>
         </w:tc>
@@ -5926,13 +5998,12 @@
             </w:pPr>
             <w:r>
               <w:rPr>
-                <w:color w:val="7F7F7F"/>
-                <w:i/>
-                <w:iCs/>
-                <w:sz w:val="17"/>
-                <w:szCs w:val="17"/>
-              </w:rPr>
-              <w:t xml:space="preserve">[herramienta]</w:t>
+                <w:i w:val="0"/>
+                <w:iCs/>
+                <w:sz w:val="17"/>
+                <w:szCs w:val="17"/>
+              </w:rPr>
+              <w:t>pytest + FastAPI TestClient</w:t>
             </w:r>
           </w:p>
         </w:tc>
@@ -5947,13 +6018,12 @@
             </w:pPr>
             <w:r>
               <w:rPr>
-                <w:color w:val="7F7F7F"/>
-                <w:i/>
-                <w:iCs/>
-                <w:sz w:val="17"/>
-                <w:szCs w:val="17"/>
-              </w:rPr>
-              <w:t xml:space="preserve">[ ]</w:t>
+                <w:i w:val="0"/>
+                <w:iCs/>
+                <w:sz w:val="17"/>
+                <w:szCs w:val="17"/>
+              </w:rPr>
+              <w:t>10</w:t>
             </w:r>
           </w:p>
         </w:tc>
@@ -5968,13 +6038,12 @@
             </w:pPr>
             <w:r>
               <w:rPr>
-                <w:color w:val="7F7F7F"/>
-                <w:i/>
-                <w:iCs/>
-                <w:sz w:val="17"/>
-                <w:szCs w:val="17"/>
-              </w:rPr>
-              <w:t xml:space="preserve">[Pendiente]</w:t>
+                <w:i w:val="0"/>
+                <w:iCs/>
+                <w:sz w:val="17"/>
+                <w:szCs w:val="17"/>
+              </w:rPr>
+              <w:t>16/16 passed</w:t>
             </w:r>
           </w:p>
         </w:tc>
@@ -6778,13 +6847,12 @@
             </w:pPr>
             <w:r>
               <w:rPr>
-                <w:color w:val="7F7F7F"/>
-                <w:i/>
-                <w:iCs/>
-                <w:sz w:val="17"/>
-                <w:szCs w:val="17"/>
-              </w:rPr>
-              <w:t xml:space="preserve">[Pendiente]</w:t>
+                <w:i w:val="0"/>
+                <w:iCs/>
+                <w:sz w:val="17"/>
+                <w:szCs w:val="17"/>
+              </w:rPr>
+              <w:t>Código y pruebas (HU-02)</w:t>
             </w:r>
           </w:p>
         </w:tc>
@@ -6799,13 +6867,12 @@
             </w:pPr>
             <w:r>
               <w:rPr>
-                <w:color w:val="7F7F7F"/>
-                <w:i/>
-                <w:iCs/>
-                <w:sz w:val="17"/>
-                <w:szCs w:val="17"/>
-              </w:rPr>
-              <w:t xml:space="preserve">[Pendiente]</w:t>
+                <w:i w:val="0"/>
+                <w:iCs/>
+                <w:sz w:val="17"/>
+                <w:szCs w:val="17"/>
+              </w:rPr>
+              <w:t>Claude Code (Claude Opus 5.5)</w:t>
             </w:r>
           </w:p>
         </w:tc>
@@ -6820,13 +6887,12 @@
             </w:pPr>
             <w:r>
               <w:rPr>
-                <w:color w:val="7F7F7F"/>
-                <w:i/>
-                <w:iCs/>
-                <w:sz w:val="17"/>
-                <w:szCs w:val="17"/>
-              </w:rPr>
-              <w:t xml:space="preserve">[Pendiente]</w:t>
+                <w:i w:val="0"/>
+                <w:iCs/>
+                <w:sz w:val="17"/>
+                <w:szCs w:val="17"/>
+              </w:rPr>
+              <w:t>Endpoint de disponibilidad mensual y calendario que reutilice availability.py</w:t>
             </w:r>
           </w:p>
         </w:tc>
@@ -6841,13 +6907,12 @@
             </w:pPr>
             <w:r>
               <w:rPr>
-                <w:color w:val="7F7F7F"/>
-                <w:i/>
-                <w:iCs/>
-                <w:sz w:val="17"/>
-                <w:szCs w:val="17"/>
-              </w:rPr>
-              <w:t xml:space="preserve">[Pendiente]</w:t>
+                <w:i w:val="0"/>
+                <w:iCs/>
+                <w:sz w:val="17"/>
+                <w:szCs w:val="17"/>
+              </w:rPr>
+              <w:t>Endpoint, calendario y 14 pruebas; 2 errores visuales y 1 cambio que daba conflicto con HU-04</w:t>
             </w:r>
           </w:p>
         </w:tc>
@@ -6862,13 +6927,12 @@
             </w:pPr>
             <w:r>
               <w:rPr>
-                <w:color w:val="7F7F7F"/>
-                <w:i/>
-                <w:iCs/>
-                <w:sz w:val="17"/>
-                <w:szCs w:val="17"/>
-              </w:rPr>
-              <w:t xml:space="preserve">[Pendiente]</w:t>
+                <w:i w:val="0"/>
+                <w:iCs/>
+                <w:sz w:val="17"/>
+                <w:szCs w:val="17"/>
+              </w:rPr>
+              <w:t>Aceptada tras corregir los errores (Roy)</w:t>
             </w:r>
           </w:p>
         </w:tc>
@@ -6888,13 +6952,12 @@
             </w:pPr>
             <w:r>
               <w:rPr>
-                <w:color w:val="7F7F7F"/>
-                <w:i/>
-                <w:iCs/>
-                <w:sz w:val="17"/>
-                <w:szCs w:val="17"/>
-              </w:rPr>
-              <w:t xml:space="preserve">[Pendiente]</w:t>
+                <w:i w:val="0"/>
+                <w:iCs/>
+                <w:sz w:val="17"/>
+                <w:szCs w:val="17"/>
+              </w:rPr>
+              <w:t>Código y pruebas (HU-05)</w:t>
             </w:r>
           </w:p>
         </w:tc>
@@ -6909,13 +6972,12 @@
             </w:pPr>
             <w:r>
               <w:rPr>
-                <w:color w:val="7F7F7F"/>
-                <w:i/>
-                <w:iCs/>
-                <w:sz w:val="17"/>
-                <w:szCs w:val="17"/>
-              </w:rPr>
-              <w:t xml:space="preserve">[Pendiente]</w:t>
+                <w:i w:val="0"/>
+                <w:iCs/>
+                <w:sz w:val="17"/>
+                <w:szCs w:val="17"/>
+              </w:rPr>
+              <w:t>Claude Code (Claude Opus 5.5)</w:t>
             </w:r>
           </w:p>
         </w:tc>
@@ -6930,13 +6992,12 @@
             </w:pPr>
             <w:r>
               <w:rPr>
-                <w:color w:val="7F7F7F"/>
-                <w:i/>
-                <w:iCs/>
-                <w:sz w:val="17"/>
-                <w:szCs w:val="17"/>
-              </w:rPr>
-              <w:t xml:space="preserve">[Pendiente]</w:t>
+                <w:i w:val="0"/>
+                <w:iCs/>
+                <w:sz w:val="17"/>
+                <w:szCs w:val="17"/>
+              </w:rPr>
+              <w:t>Exportar las reservas a CSV con filtros y un botón en el panel admin</w:t>
             </w:r>
           </w:p>
         </w:tc>
@@ -6951,13 +7012,12 @@
             </w:pPr>
             <w:r>
               <w:rPr>
-                <w:color w:val="7F7F7F"/>
-                <w:i/>
-                <w:iCs/>
-                <w:sz w:val="17"/>
-                <w:szCs w:val="17"/>
-              </w:rPr>
-              <w:t xml:space="preserve">[Pendiente]</w:t>
+                <w:i w:val="0"/>
+                <w:iCs/>
+                <w:sz w:val="17"/>
+                <w:szCs w:val="17"/>
+              </w:rPr>
+              <w:t>export.py, endpoint, botón y 10 pruebas; CSV con BOM y protección contra fórmulas</w:t>
             </w:r>
           </w:p>
         </w:tc>
@@ -6972,13 +7032,12 @@
             </w:pPr>
             <w:r>
               <w:rPr>
-                <w:color w:val="7F7F7F"/>
-                <w:i/>
-                <w:iCs/>
-                <w:sz w:val="17"/>
-                <w:szCs w:val="17"/>
-              </w:rPr>
-              <w:t xml:space="preserve">[Pendiente]</w:t>
+                <w:i w:val="0"/>
+                <w:iCs/>
+                <w:sz w:val="17"/>
+                <w:szCs w:val="17"/>
+              </w:rPr>
+              <w:t>Aceptada (Roy)</w:t>
             </w:r>
           </w:p>
         </w:tc>
@@ -6998,13 +7057,12 @@
             </w:pPr>
             <w:r>
               <w:rPr>
-                <w:color w:val="7F7F7F"/>
-                <w:i/>
-                <w:iCs/>
-                <w:sz w:val="17"/>
-                <w:szCs w:val="17"/>
-              </w:rPr>
-              <w:t xml:space="preserve">[Pendiente]</w:t>
+                <w:i w:val="0"/>
+                <w:iCs/>
+                <w:sz w:val="17"/>
+                <w:szCs w:val="17"/>
+              </w:rPr>
+              <w:t>QA de HU-03</w:t>
             </w:r>
           </w:p>
         </w:tc>
@@ -7019,13 +7077,12 @@
             </w:pPr>
             <w:r>
               <w:rPr>
-                <w:color w:val="7F7F7F"/>
-                <w:i/>
-                <w:iCs/>
-                <w:sz w:val="17"/>
-                <w:szCs w:val="17"/>
-              </w:rPr>
-              <w:t xml:space="preserve">[Pendiente]</w:t>
+                <w:i w:val="0"/>
+                <w:iCs/>
+                <w:sz w:val="17"/>
+                <w:szCs w:val="17"/>
+              </w:rPr>
+              <w:t>Claude Code (Claude Opus 5.5) + Playwright</w:t>
             </w:r>
           </w:p>
         </w:tc>
@@ -7040,13 +7097,12 @@
             </w:pPr>
             <w:r>
               <w:rPr>
-                <w:color w:val="7F7F7F"/>
-                <w:i/>
-                <w:iCs/>
-                <w:sz w:val="17"/>
-                <w:szCs w:val="17"/>
-              </w:rPr>
-              <w:t xml:space="preserve">[Pendiente]</w:t>
+                <w:i w:val="0"/>
+                <w:iCs/>
+                <w:sz w:val="17"/>
+                <w:szCs w:val="17"/>
+              </w:rPr>
+              <w:t>Validar la previsión: pytest, casos límite de la API y prueba en navegador</w:t>
             </w:r>
           </w:p>
         </w:tc>
@@ -7061,13 +7117,12 @@
             </w:pPr>
             <w:r>
               <w:rPr>
-                <w:color w:val="7F7F7F"/>
-                <w:i/>
-                <w:iCs/>
-                <w:sz w:val="17"/>
-                <w:szCs w:val="17"/>
-              </w:rPr>
-              <w:t xml:space="preserve">[Pendiente]</w:t>
+                <w:i w:val="0"/>
+                <w:iCs/>
+                <w:sz w:val="17"/>
+                <w:szCs w:val="17"/>
+              </w:rPr>
+              <w:t>13 / 20 / 62 passed; casos límite correctos; 4 observaciones nuevas no bloqueantes</w:t>
             </w:r>
           </w:p>
         </w:tc>
@@ -7082,13 +7137,12 @@
             </w:pPr>
             <w:r>
               <w:rPr>
-                <w:color w:val="7F7F7F"/>
-                <w:i/>
-                <w:iCs/>
-                <w:sz w:val="17"/>
-                <w:szCs w:val="17"/>
-              </w:rPr>
-              <w:t xml:space="preserve">[Pendiente]</w:t>
+                <w:i w:val="0"/>
+                <w:iCs/>
+                <w:sz w:val="17"/>
+                <w:szCs w:val="17"/>
+              </w:rPr>
+              <w:t>Aprobado por QA con observaciones (Roy)</w:t>
             </w:r>
           </w:p>
         </w:tc>
@@ -7597,13 +7651,12 @@
             </w:pPr>
             <w:r>
               <w:rPr>
-                <w:color w:val="7F7F7F"/>
-                <w:i/>
-                <w:iCs/>
-                <w:sz w:val="17"/>
-                <w:szCs w:val="17"/>
-              </w:rPr>
-              <w:t xml:space="preserve">[#]</w:t>
+                <w:i w:val="0"/>
+                <w:iCs/>
+                <w:sz w:val="17"/>
+                <w:szCs w:val="17"/>
+              </w:rPr>
+              <w:t>3</w:t>
             </w:r>
           </w:p>
         </w:tc>
@@ -7618,13 +7671,12 @@
             </w:pPr>
             <w:r>
               <w:rPr>
-                <w:color w:val="7F7F7F"/>
-                <w:i/>
-                <w:iCs/>
-                <w:sz w:val="17"/>
-                <w:szCs w:val="17"/>
-              </w:rPr>
-              <w:t xml:space="preserve">[Pendiente]</w:t>
+                <w:i w:val="0"/>
+                <w:iCs/>
+                <w:sz w:val="17"/>
+                <w:szCs w:val="17"/>
+              </w:rPr>
+              <w:t>Claude Code (Claude Opus 5.5)</w:t>
             </w:r>
           </w:p>
         </w:tc>
@@ -7639,13 +7691,12 @@
             </w:pPr>
             <w:r>
               <w:rPr>
-                <w:color w:val="7F7F7F"/>
-                <w:i/>
-                <w:iCs/>
-                <w:sz w:val="17"/>
-                <w:szCs w:val="17"/>
-              </w:rPr>
-              <w:t xml:space="preserve">[Pendiente]</w:t>
+                <w:i w:val="0"/>
+                <w:iCs/>
+                <w:sz w:val="17"/>
+                <w:szCs w:val="17"/>
+              </w:rPr>
+              <w:t>HU-02: título del calendario con mayúscula inicial</w:t>
             </w:r>
           </w:p>
         </w:tc>
@@ -7660,13 +7711,12 @@
             </w:pPr>
             <w:r>
               <w:rPr>
-                <w:color w:val="7F7F7F"/>
-                <w:i/>
-                <w:iCs/>
-                <w:sz w:val="17"/>
-                <w:szCs w:val="17"/>
-              </w:rPr>
-              <w:t xml:space="preserve">[Pendiente]</w:t>
+                <w:i w:val="0"/>
+                <w:iCs/>
+                <w:sz w:val="17"/>
+                <w:szCs w:val="17"/>
+              </w:rPr>
+              <w:t>Usó text-transform: capitalize, que pone mayúscula a cada palabra: «Octubre De 2026»</w:t>
             </w:r>
           </w:p>
         </w:tc>
@@ -7681,13 +7731,12 @@
             </w:pPr>
             <w:r>
               <w:rPr>
-                <w:color w:val="7F7F7F"/>
-                <w:i/>
-                <w:iCs/>
-                <w:sz w:val="17"/>
-                <w:szCs w:val="17"/>
-              </w:rPr>
-              <w:t xml:space="preserve">[Pendiente]</w:t>
+                <w:i w:val="0"/>
+                <w:iCs/>
+                <w:sz w:val="17"/>
+                <w:szCs w:val="17"/>
+              </w:rPr>
+              <w:t>Revisando la captura de Playwright</w:t>
             </w:r>
           </w:p>
         </w:tc>
@@ -7702,13 +7751,12 @@
             </w:pPr>
             <w:r>
               <w:rPr>
-                <w:color w:val="7F7F7F"/>
-                <w:i/>
-                <w:iCs/>
-                <w:sz w:val="17"/>
-                <w:szCs w:val="17"/>
-              </w:rPr>
-              <w:t xml:space="preserve">[Pendiente]</w:t>
+                <w:i w:val="0"/>
+                <w:iCs/>
+                <w:sz w:val="17"/>
+                <w:szCs w:val="17"/>
+              </w:rPr>
+              <w:t>Se capitaliza solo la primera letra desde JavaScript</w:t>
             </w:r>
           </w:p>
         </w:tc>
@@ -7728,13 +7776,12 @@
             </w:pPr>
             <w:r>
               <w:rPr>
-                <w:color w:val="7F7F7F"/>
-                <w:i/>
-                <w:iCs/>
-                <w:sz w:val="17"/>
-                <w:szCs w:val="17"/>
-              </w:rPr>
-              <w:t xml:space="preserve">[#]</w:t>
+                <w:i w:val="0"/>
+                <w:iCs/>
+                <w:sz w:val="17"/>
+                <w:szCs w:val="17"/>
+              </w:rPr>
+              <w:t>4</w:t>
             </w:r>
           </w:p>
         </w:tc>
@@ -7749,13 +7796,12 @@
             </w:pPr>
             <w:r>
               <w:rPr>
-                <w:color w:val="7F7F7F"/>
-                <w:i/>
-                <w:iCs/>
-                <w:sz w:val="17"/>
-                <w:szCs w:val="17"/>
-              </w:rPr>
-              <w:t xml:space="preserve">[Pendiente]</w:t>
+                <w:i w:val="0"/>
+                <w:iCs/>
+                <w:sz w:val="17"/>
+                <w:szCs w:val="17"/>
+              </w:rPr>
+              <w:t>Claude Code (Claude Opus 5.5)</w:t>
             </w:r>
           </w:p>
         </w:tc>
@@ -7770,13 +7816,12 @@
             </w:pPr>
             <w:r>
               <w:rPr>
-                <w:color w:val="7F7F7F"/>
-                <w:i/>
-                <w:iCs/>
-                <w:sz w:val="17"/>
-                <w:szCs w:val="17"/>
-              </w:rPr>
-              <w:t xml:space="preserve">[Pendiente]</w:t>
+                <w:i w:val="0"/>
+                <w:iCs/>
+                <w:sz w:val="17"/>
+                <w:szCs w:val="17"/>
+              </w:rPr>
+              <w:t>HU-02: celdas cuadradas para los días</w:t>
             </w:r>
           </w:p>
         </w:tc>
@@ -7791,13 +7836,12 @@
             </w:pPr>
             <w:r>
               <w:rPr>
-                <w:color w:val="7F7F7F"/>
-                <w:i/>
-                <w:iCs/>
-                <w:sz w:val="17"/>
-                <w:szCs w:val="17"/>
-              </w:rPr>
-              <w:t xml:space="preserve">[Pendiente]</w:t>
+                <w:i w:val="0"/>
+                <w:iCs/>
+                <w:sz w:val="17"/>
+                <w:szCs w:val="17"/>
+              </w:rPr>
+              <w:t>Limitó la altura pero no el ancho: las celdas quedaban pegadas a la izquierda, desalineadas con Lu…Do</w:t>
             </w:r>
           </w:p>
         </w:tc>
@@ -7812,13 +7856,12 @@
             </w:pPr>
             <w:r>
               <w:rPr>
-                <w:color w:val="7F7F7F"/>
-                <w:i/>
-                <w:iCs/>
-                <w:sz w:val="17"/>
-                <w:szCs w:val="17"/>
-              </w:rPr>
-              <w:t xml:space="preserve">[Pendiente]</w:t>
+                <w:i w:val="0"/>
+                <w:iCs/>
+                <w:sz w:val="17"/>
+                <w:szCs w:val="17"/>
+              </w:rPr>
+              <w:t>Revisando la captura de Playwright</w:t>
             </w:r>
           </w:p>
         </w:tc>
@@ -7833,13 +7876,12 @@
             </w:pPr>
             <w:r>
               <w:rPr>
-                <w:color w:val="7F7F7F"/>
-                <w:i/>
-                <w:iCs/>
-                <w:sz w:val="17"/>
-                <w:szCs w:val="17"/>
-              </w:rPr>
-              <w:t xml:space="preserve">[Pendiente]</w:t>
+                <w:i w:val="0"/>
+                <w:iCs/>
+                <w:sz w:val="17"/>
+                <w:szCs w:val="17"/>
+              </w:rPr>
+              <w:t>max-width + justify-self: center con aspect-ratio: 1/1</w:t>
             </w:r>
           </w:p>
         </w:tc>
@@ -8128,13 +8170,12 @@
             </w:pPr>
             <w:r>
               <w:rPr>
-                <w:color w:val="7F7F7F"/>
-                <w:i/>
-                <w:iCs/>
-                <w:sz w:val="17"/>
-                <w:szCs w:val="17"/>
-              </w:rPr>
-              <w:t xml:space="preserve">[#]</w:t>
+                <w:i w:val="0"/>
+                <w:iCs/>
+                <w:sz w:val="17"/>
+                <w:szCs w:val="17"/>
+              </w:rPr>
+              <w:t>2</w:t>
             </w:r>
           </w:p>
         </w:tc>
@@ -8149,13 +8190,12 @@
             </w:pPr>
             <w:r>
               <w:rPr>
-                <w:color w:val="7F7F7F"/>
-                <w:i/>
-                <w:iCs/>
-                <w:sz w:val="17"/>
-                <w:szCs w:val="17"/>
-              </w:rPr>
-              <w:t xml:space="preserve">[Pendiente]</w:t>
+                <w:i w:val="0"/>
+                <w:iCs/>
+                <w:sz w:val="17"/>
+                <w:szCs w:val="17"/>
+              </w:rPr>
+              <w:t>HU-02: agregar «from typing import Optional» en availability.py y sumar month_availability al import existente de public.py</w:t>
             </w:r>
           </w:p>
         </w:tc>
@@ -8170,13 +8210,12 @@
             </w:pPr>
             <w:r>
               <w:rPr>
-                <w:color w:val="7F7F7F"/>
-                <w:i/>
-                <w:iCs/>
-                <w:sz w:val="17"/>
-                <w:szCs w:val="17"/>
-              </w:rPr>
-              <w:t xml:space="preserve">[Pendiente]</w:t>
+                <w:i w:val="0"/>
+                <w:iCs/>
+                <w:sz w:val="17"/>
+                <w:szCs w:val="17"/>
+              </w:rPr>
+              <w:t>Un merge de prueba con la rama de HU-04 dio conflicto: HU-04 agrega esas mismas líneas</w:t>
             </w:r>
           </w:p>
         </w:tc>
@@ -8191,13 +8230,12 @@
             </w:pPr>
             <w:r>
               <w:rPr>
-                <w:color w:val="7F7F7F"/>
-                <w:i/>
-                <w:iCs/>
-                <w:sz w:val="17"/>
-                <w:szCs w:val="17"/>
-              </w:rPr>
-              <w:t xml:space="preserve">[Pendiente]</w:t>
+                <w:i w:val="0"/>
+                <w:iCs/>
+                <w:sz w:val="17"/>
+                <w:szCs w:val="17"/>
+              </w:rPr>
+              <w:t>date | None (válido con from __future__ import annotations) y el import nuevo en su propia línea; el merge con las demás ramas queda limpio</w:t>
             </w:r>
           </w:p>
         </w:tc>
@@ -8879,13 +8917,12 @@
             </w:pPr>
             <w:r>
               <w:rPr>
-                <w:color w:val="7F7F7F"/>
-                <w:i/>
-                <w:iCs/>
-                <w:sz w:val="17"/>
-                <w:szCs w:val="17"/>
-              </w:rPr>
-              <w:t xml:space="preserve">[#]</w:t>
+                <w:i w:val="0"/>
+                <w:iCs/>
+                <w:sz w:val="17"/>
+                <w:szCs w:val="17"/>
+              </w:rPr>
+              <w:t>10</w:t>
             </w:r>
           </w:p>
         </w:tc>
@@ -8900,13 +8937,12 @@
             </w:pPr>
             <w:r>
               <w:rPr>
-                <w:color w:val="7F7F7F"/>
-                <w:i/>
-                <w:iCs/>
-                <w:sz w:val="17"/>
-                <w:szCs w:val="17"/>
-              </w:rPr>
-              <w:t xml:space="preserve">[Pendiente]</w:t>
+                <w:i w:val="0"/>
+                <w:iCs/>
+                <w:sz w:val="17"/>
+                <w:szCs w:val="17"/>
+              </w:rPr>
+              <w:t>HU-02: el calendario usa la fecha local y el backend decide qué días son pasados con la zona horaria del negocio</w:t>
             </w:r>
           </w:p>
         </w:tc>
@@ -8921,13 +8957,12 @@
             </w:pPr>
             <w:r>
               <w:rPr>
-                <w:color w:val="7F7F7F"/>
-                <w:i/>
-                <w:iCs/>
-                <w:sz w:val="17"/>
-                <w:szCs w:val="17"/>
-              </w:rPr>
-              <w:t xml:space="preserve">[Pendiente]</w:t>
+                <w:i w:val="0"/>
+                <w:iCs/>
+                <w:sz w:val="17"/>
+                <w:szCs w:val="17"/>
+              </w:rPr>
+              <w:t>Mantener el min del input calculado con toISOString() (UTC)</w:t>
             </w:r>
           </w:p>
         </w:tc>
@@ -8942,13 +8977,12 @@
             </w:pPr>
             <w:r>
               <w:rPr>
-                <w:color w:val="7F7F7F"/>
-                <w:i/>
-                <w:iCs/>
-                <w:sz w:val="17"/>
-                <w:szCs w:val="17"/>
-              </w:rPr>
-              <w:t xml:space="preserve">[Pendiente]</w:t>
+                <w:i w:val="0"/>
+                <w:iCs/>
+                <w:sz w:val="17"/>
+                <w:szCs w:val="17"/>
+              </w:rPr>
+              <w:t>Roy (Developer); a confirmar por Einer (Reviewer)</w:t>
             </w:r>
           </w:p>
         </w:tc>
@@ -8963,13 +8997,12 @@
             </w:pPr>
             <w:r>
               <w:rPr>
-                <w:color w:val="7F7F7F"/>
-                <w:i/>
-                <w:iCs/>
-                <w:sz w:val="17"/>
-                <w:szCs w:val="17"/>
-              </w:rPr>
-              <w:t xml:space="preserve">[Pendiente]</w:t>
+                <w:i w:val="0"/>
+                <w:iCs/>
+                <w:sz w:val="17"/>
+                <w:szCs w:val="17"/>
+              </w:rPr>
+              <w:t>Corrige el bug anotado en HU-01: de noche en Panamá la fecha UTC ya es «mañana» y bloqueaba «hoy»</w:t>
             </w:r>
           </w:p>
         </w:tc>
@@ -8989,13 +9022,12 @@
             </w:pPr>
             <w:r>
               <w:rPr>
-                <w:color w:val="7F7F7F"/>
-                <w:i/>
-                <w:iCs/>
-                <w:sz w:val="17"/>
-                <w:szCs w:val="17"/>
-              </w:rPr>
-              <w:t xml:space="preserve">[#]</w:t>
+                <w:i w:val="0"/>
+                <w:iCs/>
+                <w:sz w:val="17"/>
+                <w:szCs w:val="17"/>
+              </w:rPr>
+              <w:t>14</w:t>
             </w:r>
           </w:p>
         </w:tc>
@@ -9010,13 +9042,12 @@
             </w:pPr>
             <w:r>
               <w:rPr>
-                <w:color w:val="7F7F7F"/>
-                <w:i/>
-                <w:iCs/>
-                <w:sz w:val="17"/>
-                <w:szCs w:val="17"/>
-              </w:rPr>
-              <w:t xml:space="preserve">[Pendiente]</w:t>
+                <w:i w:val="0"/>
+                <w:iCs/>
+                <w:sz w:val="17"/>
+                <w:szCs w:val="17"/>
+              </w:rPr>
+              <w:t>HU-05: anteponer ' al nombre, servicio y notas que empiecen con = + - @</w:t>
             </w:r>
           </w:p>
         </w:tc>
@@ -9031,13 +9062,12 @@
             </w:pPr>
             <w:r>
               <w:rPr>
-                <w:color w:val="7F7F7F"/>
-                <w:i/>
-                <w:iCs/>
-                <w:sz w:val="17"/>
-                <w:szCs w:val="17"/>
-              </w:rPr>
-              <w:t xml:space="preserve">[Pendiente]</w:t>
+                <w:i w:val="0"/>
+                <w:iCs/>
+                <w:sz w:val="17"/>
+                <w:szCs w:val="17"/>
+              </w:rPr>
+              <w:t>Exportar el texto tal cual</w:t>
             </w:r>
           </w:p>
         </w:tc>
@@ -9052,13 +9082,12 @@
             </w:pPr>
             <w:r>
               <w:rPr>
-                <w:color w:val="7F7F7F"/>
-                <w:i/>
-                <w:iCs/>
-                <w:sz w:val="17"/>
-                <w:szCs w:val="17"/>
-              </w:rPr>
-              <w:t xml:space="preserve">[Pendiente]</w:t>
+                <w:i w:val="0"/>
+                <w:iCs/>
+                <w:sz w:val="17"/>
+                <w:szCs w:val="17"/>
+              </w:rPr>
+              <w:t>Roy (Developer); a confirmar por Einer (Reviewer)</w:t>
             </w:r>
           </w:p>
         </w:tc>
@@ -9073,13 +9102,12 @@
             </w:pPr>
             <w:r>
               <w:rPr>
-                <w:color w:val="7F7F7F"/>
-                <w:i/>
-                <w:iCs/>
-                <w:sz w:val="17"/>
-                <w:szCs w:val="17"/>
-              </w:rPr>
-              <w:t xml:space="preserve">[Pendiente]</w:t>
+                <w:i w:val="0"/>
+                <w:iCs/>
+                <w:sz w:val="17"/>
+                <w:szCs w:val="17"/>
+              </w:rPr>
+              <w:t>Ese texto lo escribe el cliente en la página pública; sin esto, un nombre como =HYPERLINK(...) se ejecutaría como fórmula al abrir el archivo</w:t>
             </w:r>
           </w:p>
         </w:tc>

</xml_diff>

<commit_message>
Evidencias: actualiza Word y presentación con la revisión de Roy y los PR #14 y #15
9 PR (5 con revisión registrada), AI Log con 24 registros, 5 respuestas incorrectas, 1 rechazo y
18 decisiones; QA de Einer en HU-01 y HU-04; revisión de Einer en HU-02 y HU-05; numeración y
referencias corregidas. PDF regenerado.

Co-Authored-By: Claude Sonnet 5.5 <noreply@anthropic.com>
</commit_message>
<xml_diff>
--- a/docs/1GS242_Proyecto1_Evidencias_IA.docx
+++ b/docs/1GS242_Proyecto1_Evidencias_IA.docx
@@ -2086,7 +2086,7 @@
                 <w:color w:val="000000"/>
                 <w:sz w:val="17"/>
               </w:rPr>
-              <w:t>Fusionado. Revisó Roy (aprobó). QA: Einer (sin registro).</w:t>
+              <w:t>Fusionado. Revisó Roy (aprobó). QA: Einer (con capturas, PR #6).</w:t>
             </w:r>
           </w:p>
         </w:tc>
@@ -2206,7 +2206,7 @@
                 <w:color w:val="000000"/>
                 <w:sz w:val="17"/>
               </w:rPr>
-              <w:t>Fusionado. QA: Kelvin (aprobó). Revisión de Einer: sin registro.</w:t>
+              <w:t>Fusionado. QA: Kelvin (aprobó). Revisó Einer después del merge (aprobó con observaciones).</w:t>
             </w:r>
           </w:p>
         </w:tc>
@@ -2447,7 +2447,7 @@
                 <w:color w:val="000000"/>
                 <w:sz w:val="17"/>
               </w:rPr>
-              <w:t>Fusionado. Revisó Roy (aprobó). QA: Einer (sin registro).</w:t>
+              <w:t>Fusionado. Revisó Roy (aprobó). QA: Einer (con capturas, PR #7).</w:t>
             </w:r>
           </w:p>
         </w:tc>
@@ -2569,7 +2569,7 @@
                 <w:color w:val="000000"/>
                 <w:sz w:val="17"/>
               </w:rPr>
-              <w:t>Fusionado. Comentario de Einer. QA: Kelvin (aprobó).</w:t>
+              <w:t>Fusionado. Revisó Einer (aprobó con observaciones). QA: Kelvin (aprobó).</w:t>
             </w:r>
           </w:p>
         </w:tc>
@@ -4062,11 +4062,10 @@
             <w:r>
               <w:rPr>
                 <w:i w:val="0"/>
-                <w:iCs/>
-                <w:sz w:val="17"/>
-                <w:szCs w:val="17"/>
-              </w:rPr>
-              <w:t>Claude Code (Claude Opus 5.5) analizó crud.py, routers/admin.py y admin.html; propuso ampliar list_appointments con date_from/date_to sin romper el filtro del panel y un módulo export.py aparte. Implementó el CSV con BOM UTF-8, estados en español, neutralización de fórmulas (= + - @) en el texto que escribe el cliente y la descarga con fetch + Blob (el endpoint exige el token). Quedan para confirmar con el Reviewer: separador coma, el botón exporta lo que muestra la tabla y «precio» es el precio actual del servicio (la cita no lo guarda).</w:t>
+                <w:color w:val="000000"/>
+                <w:sz w:val="17"/>
+              </w:rPr>
+              <w:t>Claude Code (Claude Opus 5.5) analizó crud.py, routers/admin.py y admin.html; propuso ampliar list_appointments con date_from/date_to sin romper el filtro del panel y un módulo export.py aparte. Implementó el CSV con BOM UTF-8, estados en español, neutralización de fórmulas (= + - @) en el texto que escribe el cliente y la descarga con fetch + Blob (el endpoint exige el token). Einer aprobó la revisión (PR #13) con dos observaciones menores: el celular puede perder el + en Excel y «precio» es el precio actual del servicio porque la cita no lo guarda.</w:t>
             </w:r>
           </w:p>
         </w:tc>
@@ -4284,7 +4283,7 @@
         <w:jc w:val="both"/>
       </w:pPr>
       <w:r>
-        <w:t>Repositorio del grupo: https://github.com/kelvinhe04/citafacil (público). Se clonó gianca675/citafacil (licencia MIT, se conserva su crédito y su historial) y se subió a un repositorio propio. En total: 5 issues de historias de usuario y 7 Pull Requests, todos fusionados en main.</w:t>
+        <w:t>Repositorio del grupo: https://github.com/kelvinhe04/citafacil (público). Se clonó gianca675/citafacil (licencia MIT, se conserva su crédito y su historial) y se subió a un repositorio propio. En total: 5 issues de historias de usuario y 9 Pull Requests, todos fusionados en main.</w:t>
       </w:r>
     </w:p>
     <w:p>
@@ -6436,7 +6435,7 @@
                 <w:color w:val="000000"/>
                 <w:sz w:val="17"/>
               </w:rPr>
-              <w:t>Aprobado por Roy; fusionado.</w:t>
+              <w:t>Aprobado por Roy; fusionado. QA de Einer con capturas.</w:t>
             </w:r>
           </w:p>
         </w:tc>
@@ -6536,7 +6535,7 @@
                 <w:color w:val="000000"/>
                 <w:sz w:val="17"/>
               </w:rPr>
-              <w:t>Aprobado por Roy con observaciones no bloqueantes; fusionado.</w:t>
+              <w:t>Aprobado por Roy con observaciones no bloqueantes; fusionado. QA de Einer con capturas.</w:t>
             </w:r>
           </w:p>
         </w:tc>
@@ -6936,7 +6935,7 @@
                 <w:color w:val="000000"/>
                 <w:sz w:val="17"/>
               </w:rPr>
-              <w:t>Fusionado; revisión de Einer sin registro; QA de Kelvin aprobado.</w:t>
+              <w:t>Revisión de Einer después del merge, aprobada con observaciones; QA de Kelvin aprobado.</w:t>
             </w:r>
           </w:p>
         </w:tc>
@@ -7036,7 +7035,207 @@
                 <w:color w:val="000000"/>
                 <w:sz w:val="17"/>
               </w:rPr>
-              <w:t>Fusionado con un comentario de Einer; QA de Kelvin aprobado.</w:t>
+              <w:t>Revisión de Einer aprobada con observaciones; QA de Kelvin aprobado.</w:t>
+            </w:r>
+          </w:p>
+        </w:tc>
+      </w:tr>
+      <w:tr>
+        <w:trPr>
+          <w:cantSplit/>
+        </w:trPr>
+        <w:tc>
+          <w:tcPr>
+            <w:tcW w:w="800" w:type="dxa"/>
+            <w:vAlign w:val="center"/>
+          </w:tcPr>
+          <w:p>
+            <w:pPr>
+              <w:spacing w:after="40" w:line="252" w:lineRule="auto"/>
+            </w:pPr>
+            <w:r>
+              <w:rPr>
+                <w:i w:val="0"/>
+                <w:color w:val="000000"/>
+                <w:sz w:val="17"/>
+              </w:rPr>
+              <w:t>#14</w:t>
+            </w:r>
+          </w:p>
+        </w:tc>
+        <w:tc>
+          <w:tcPr>
+            <w:tcW w:w="3160" w:type="dxa"/>
+            <w:vAlign w:val="center"/>
+          </w:tcPr>
+          <w:p>
+            <w:pPr>
+              <w:spacing w:after="40" w:line="252" w:lineRule="auto"/>
+            </w:pPr>
+            <w:r>
+              <w:rPr>
+                <w:i w:val="0"/>
+                <w:color w:val="000000"/>
+                <w:sz w:val="17"/>
+              </w:rPr>
+              <w:t>AI Log: filas de Einer (HU-03, QA de HU-01/HU-04, revisión de HU-02)</w:t>
+            </w:r>
+          </w:p>
+        </w:tc>
+        <w:tc>
+          <w:tcPr>
+            <w:tcW w:w="1800" w:type="dxa"/>
+            <w:vAlign w:val="center"/>
+          </w:tcPr>
+          <w:p>
+            <w:pPr>
+              <w:spacing w:after="40" w:line="252" w:lineRule="auto"/>
+            </w:pPr>
+            <w:r>
+              <w:rPr>
+                <w:i w:val="0"/>
+                <w:color w:val="000000"/>
+                <w:sz w:val="17"/>
+              </w:rPr>
+              <w:t>Einer</w:t>
+            </w:r>
+          </w:p>
+        </w:tc>
+        <w:tc>
+          <w:tcPr>
+            <w:tcW w:w="1800" w:type="dxa"/>
+            <w:vAlign w:val="center"/>
+          </w:tcPr>
+          <w:p>
+            <w:pPr>
+              <w:spacing w:after="40" w:line="252" w:lineRule="auto"/>
+            </w:pPr>
+            <w:r>
+              <w:rPr>
+                <w:i w:val="0"/>
+                <w:color w:val="000000"/>
+                <w:sz w:val="17"/>
+              </w:rPr>
+              <w:t>—</w:t>
+            </w:r>
+          </w:p>
+        </w:tc>
+        <w:tc>
+          <w:tcPr>
+            <w:tcW w:w="1800" w:type="dxa"/>
+            <w:vAlign w:val="center"/>
+          </w:tcPr>
+          <w:p>
+            <w:pPr>
+              <w:spacing w:after="40" w:line="252" w:lineRule="auto"/>
+            </w:pPr>
+            <w:r>
+              <w:rPr>
+                <w:i w:val="0"/>
+                <w:color w:val="000000"/>
+                <w:sz w:val="17"/>
+              </w:rPr>
+              <w:t>Documentación; fusionado.</w:t>
+            </w:r>
+          </w:p>
+        </w:tc>
+      </w:tr>
+      <w:tr>
+        <w:trPr>
+          <w:cantSplit/>
+        </w:trPr>
+        <w:tc>
+          <w:tcPr>
+            <w:tcW w:w="800" w:type="dxa"/>
+            <w:vAlign w:val="center"/>
+          </w:tcPr>
+          <w:p>
+            <w:pPr>
+              <w:spacing w:after="40" w:line="252" w:lineRule="auto"/>
+            </w:pPr>
+            <w:r>
+              <w:rPr>
+                <w:i w:val="0"/>
+                <w:color w:val="000000"/>
+                <w:sz w:val="17"/>
+              </w:rPr>
+              <w:t>#15</w:t>
+            </w:r>
+          </w:p>
+        </w:tc>
+        <w:tc>
+          <w:tcPr>
+            <w:tcW w:w="3160" w:type="dxa"/>
+            <w:vAlign w:val="center"/>
+          </w:tcPr>
+          <w:p>
+            <w:pPr>
+              <w:spacing w:after="40" w:line="252" w:lineRule="auto"/>
+            </w:pPr>
+            <w:r>
+              <w:rPr>
+                <w:i w:val="0"/>
+                <w:color w:val="000000"/>
+                <w:sz w:val="17"/>
+              </w:rPr>
+              <w:t>QA: capturas de HU-01 y HU-04 (Einer)</w:t>
+            </w:r>
+          </w:p>
+        </w:tc>
+        <w:tc>
+          <w:tcPr>
+            <w:tcW w:w="1800" w:type="dxa"/>
+            <w:vAlign w:val="center"/>
+          </w:tcPr>
+          <w:p>
+            <w:pPr>
+              <w:spacing w:after="40" w:line="252" w:lineRule="auto"/>
+            </w:pPr>
+            <w:r>
+              <w:rPr>
+                <w:i w:val="0"/>
+                <w:color w:val="000000"/>
+                <w:sz w:val="17"/>
+              </w:rPr>
+              <w:t>Einer</w:t>
+            </w:r>
+          </w:p>
+        </w:tc>
+        <w:tc>
+          <w:tcPr>
+            <w:tcW w:w="1800" w:type="dxa"/>
+            <w:vAlign w:val="center"/>
+          </w:tcPr>
+          <w:p>
+            <w:pPr>
+              <w:spacing w:after="40" w:line="252" w:lineRule="auto"/>
+            </w:pPr>
+            <w:r>
+              <w:rPr>
+                <w:i w:val="0"/>
+                <w:color w:val="000000"/>
+                <w:sz w:val="17"/>
+              </w:rPr>
+              <w:t>—</w:t>
+            </w:r>
+          </w:p>
+        </w:tc>
+        <w:tc>
+          <w:tcPr>
+            <w:tcW w:w="1800" w:type="dxa"/>
+            <w:vAlign w:val="center"/>
+          </w:tcPr>
+          <w:p>
+            <w:pPr>
+              <w:spacing w:after="40" w:line="252" w:lineRule="auto"/>
+            </w:pPr>
+            <w:r>
+              <w:rPr>
+                <w:i w:val="0"/>
+                <w:color w:val="000000"/>
+                <w:sz w:val="17"/>
+              </w:rPr>
+              <w:t>Evidencia; fusionado.</w:t>
             </w:r>
           </w:p>
         </w:tc>
@@ -7120,7 +7319,7 @@
                 <w:color w:val="595959"/>
                 <w:sz w:val="16"/>
               </w:rPr>
-              <w:t>Los 7 Pull Requests, todos fusionados.</w:t>
+              <w:t>Pull Requests #6 a #13 (captura del 28/10); después se fusionaron #14 y #15.</w:t>
             </w:r>
           </w:p>
           <w:p>
@@ -8541,7 +8740,7 @@
                 <w:color w:val="000000"/>
                 <w:sz w:val="17"/>
               </w:rPr>
-              <w:t>Aceptada; revisada y aprobada por Roy en el PR #7</w:t>
+              <w:t>Aceptada; revisada y aprobada por Roy (PR #7)</w:t>
             </w:r>
           </w:p>
         </w:tc>
@@ -8641,7 +8840,7 @@
                 <w:color w:val="000000"/>
                 <w:sz w:val="17"/>
               </w:rPr>
-              <w:t>Aceptada tras corregir los 2 errores de la sección 2</w:t>
+              <w:t>Aceptada tras corregir los 2 errores de la sección 7</w:t>
             </w:r>
           </w:p>
         </w:tc>
@@ -9041,7 +9240,7 @@
                 <w:color w:val="000000"/>
                 <w:sz w:val="17"/>
               </w:rPr>
-              <w:t>Aceptada; revisada y aprobada por Roy en el PR #6</w:t>
+              <w:t>Aceptada; revisada y aprobada por Roy (PR #6)</w:t>
             </w:r>
           </w:p>
         </w:tc>
@@ -9341,7 +9540,7 @@
                 <w:color w:val="000000"/>
                 <w:sz w:val="17"/>
               </w:rPr>
-              <w:t>Pendiente de revisión: probar a mano en el panel</w:t>
+              <w:t>Aceptada; la revisión de Kelvin y el QA de Roy están en el PR #10</w:t>
             </w:r>
           </w:p>
         </w:tc>
@@ -9365,7 +9564,7 @@
                 <w:color w:val="000000"/>
                 <w:sz w:val="17"/>
               </w:rPr>
-              <w:t>Arquitectura (HU-02, Roy)</w:t>
+              <w:t>Arquitectura (HU-03, Einer)</w:t>
             </w:r>
           </w:p>
         </w:tc>
@@ -9384,7 +9583,7 @@
                 <w:color w:val="000000"/>
                 <w:sz w:val="17"/>
               </w:rPr>
-              <w:t>Claude Code (Claude Opus 5.5)</w:t>
+              <w:t>Claude Code (Claude Sonnet 5.5)</w:t>
             </w:r>
           </w:p>
         </w:tc>
@@ -9403,7 +9602,7 @@
                 <w:color w:val="000000"/>
                 <w:sz w:val="17"/>
               </w:rPr>
-              <w:t>Analizar availability.py, routers/public.py, index.html y las ramas abiertas (HU-01, HU-03, HU-04, fix) antes de programar</w:t>
+              <w:t>Leer models.py, crud.py, routers/admin.py, schemas.py, admin.html y las pruebas antes de programar</w:t>
             </w:r>
           </w:p>
         </w:tc>
@@ -9422,7 +9621,7 @@
                 <w:color w:val="000000"/>
                 <w:sz w:val="17"/>
               </w:rPr>
-              <w:t>Propuso reutilizar generate_slots día por día; detectó que HU-04 cambia la firma de generate_slots y el import de public.py (riesgo de conflicto)</w:t>
+              <w:t>Propuso un módulo aparte forecast.py que agregue el histórico de appointments y un pronóstico simple por promedio del día de la semana, sin librerías de gráficos ni cambios de esquema</w:t>
             </w:r>
           </w:p>
         </w:tc>
@@ -9465,7 +9664,7 @@
                 <w:color w:val="000000"/>
                 <w:sz w:val="17"/>
               </w:rPr>
-              <w:t>Código (HU-02, Roy)</w:t>
+              <w:t>Testing (HU-03, Einer)</w:t>
             </w:r>
           </w:p>
         </w:tc>
@@ -9484,7 +9683,7 @@
                 <w:color w:val="000000"/>
                 <w:sz w:val="17"/>
               </w:rPr>
-              <w:t>Claude Code (Claude Opus 5.5)</w:t>
+              <w:t>Claude Code (Claude Sonnet 5.5)</w:t>
             </w:r>
           </w:p>
         </w:tc>
@@ -9503,7 +9702,7 @@
                 <w:color w:val="000000"/>
                 <w:sz w:val="17"/>
               </w:rPr>
-              <w:t>Endpoint GET /api/availability/month?service_id=&amp;month=YYYY-MM con el estado de cada día</w:t>
+              <w:t>Crear pruebas automatizadas de la historia</w:t>
             </w:r>
           </w:p>
         </w:tc>
@@ -9522,7 +9721,7 @@
                 <w:color w:val="000000"/>
                 <w:sz w:val="17"/>
               </w:rPr>
-              <w:t>month_availability() en availability.py, esquema DayAvailabilityOut, validación del mes con regex (422) y 404 para servicio inactivo</w:t>
+              <w:t>test_forecast.py: 7 pruebas (sin datos, canceladas, ventana de fechas, promedio por día de la semana, agrupación por servicio, token y parámetros); suite en 13/13. Una prueba salió mal la primera vez (sección 7, #3)</w:t>
             </w:r>
           </w:p>
         </w:tc>
@@ -9541,7 +9740,7 @@
                 <w:color w:val="000000"/>
                 <w:sz w:val="17"/>
               </w:rPr>
-              <w:t>Aceptada; pendiente de revisión por Einer</w:t>
+              <w:t>Aceptada tras corregir la prueba</w:t>
             </w:r>
           </w:p>
         </w:tc>
@@ -9565,7 +9764,7 @@
                 <w:color w:val="000000"/>
                 <w:sz w:val="17"/>
               </w:rPr>
-              <w:t>Código (HU-02, Roy)</w:t>
+              <w:t>QA (pre-chequeo con IA) (HU-01, Einer)</w:t>
             </w:r>
           </w:p>
         </w:tc>
@@ -9584,7 +9783,7 @@
                 <w:color w:val="000000"/>
                 <w:sz w:val="17"/>
               </w:rPr>
-              <w:t>Claude Code (Claude Opus 5.5)</w:t>
+              <w:t>Claude Code (Claude Sonnet 5.5)</w:t>
             </w:r>
           </w:p>
         </w:tc>
@@ -9603,7 +9802,7 @@
                 <w:color w:val="000000"/>
                 <w:sz w:val="17"/>
               </w:rPr>
-              <w:t>Reemplazar el &lt;input type="date"&gt; por un calendario mensual</w:t>
+              <w:t>Probar HU-01 en la app integrada: reserva nueva, guardado de datos, recarga y reserva en un clic</w:t>
             </w:r>
           </w:p>
         </w:tc>
@@ -9622,7 +9821,7 @@
                 <w:color w:val="000000"/>
                 <w:sz w:val="17"/>
               </w:rPr>
-              <w:t>Calendario lunes-domingo con días disponibles (verde), ocupados (rojo, tachado) y cerrados/pasados (gris); solo los disponibles son clicables</w:t>
+              <w:t>Reserva confirmada con el celular normalizado (+56942916570); nombre y celular guardados en localStorage; tras recargar aparece "Reservar como…"</w:t>
             </w:r>
           </w:p>
         </w:tc>
@@ -9641,7 +9840,7 @@
                 <w:color w:val="000000"/>
                 <w:sz w:val="17"/>
               </w:rPr>
-              <w:t>Aceptada tras corregir los errores 3 y 4 de la sección 2</w:t>
+              <w:t>Aceptada</w:t>
             </w:r>
           </w:p>
         </w:tc>
@@ -9665,7 +9864,7 @@
                 <w:color w:val="000000"/>
                 <w:sz w:val="17"/>
               </w:rPr>
-              <w:t>Testing (HU-02, Roy)</w:t>
+              <w:t>QA (pre-chequeo con IA) (HU-04, Einer)</w:t>
             </w:r>
           </w:p>
         </w:tc>
@@ -9684,7 +9883,7 @@
                 <w:color w:val="000000"/>
                 <w:sz w:val="17"/>
               </w:rPr>
-              <w:t>Claude Code (Claude Opus 5.5)</w:t>
+              <w:t>Claude Code (Claude Sonnet 5.5)</w:t>
             </w:r>
           </w:p>
         </w:tc>
@@ -9703,7 +9902,7 @@
                 <w:color w:val="000000"/>
                 <w:sz w:val="17"/>
               </w:rPr>
-              <w:t>Crear pruebas automatizadas de la historia</w:t>
+              <w:t>Probar HU-04: reservar, abrir el enlace de gestión, reprogramar y cancelar</w:t>
             </w:r>
           </w:p>
         </w:tc>
@@ -9722,7 +9921,7 @@
                 <w:color w:val="000000"/>
                 <w:sz w:val="17"/>
               </w:rPr>
-              <w:t>test_calendar.py: 14 pruebas (incluye mes bisiesto, día lleno, cita cancelada que no bloquea y formatos de mes inválidos); suite en 20/20</w:t>
+              <w:t>El enlace aparece al confirmar; consultar, reprogramar y cancelar responden 200</w:t>
             </w:r>
           </w:p>
         </w:tc>
@@ -9765,7 +9964,7 @@
                 <w:color w:val="000000"/>
                 <w:sz w:val="17"/>
               </w:rPr>
-              <w:t>Testing (pre-chequeo del Developer) (HU-02, Roy)</w:t>
+              <w:t>Revisión del diff (Reviewer) (HU-02, Einer)</w:t>
             </w:r>
           </w:p>
         </w:tc>
@@ -9784,7 +9983,7 @@
                 <w:color w:val="000000"/>
                 <w:sz w:val="17"/>
               </w:rPr>
-              <w:t>Claude Code (Claude Opus 5.5) + Playwright</w:t>
+              <w:t>Claude Code (Claude Sonnet 5.5)</w:t>
             </w:r>
           </w:p>
         </w:tc>
@@ -9803,7 +10002,7 @@
                 <w:color w:val="000000"/>
                 <w:sz w:val="17"/>
               </w:rPr>
-              <w:t>Probar en navegador: estados del mes, clic en día lleno, navegación de meses, cambio de servicio y vista móvil</w:t>
+              <w:t>Leer month_availability, el endpoint /api/availability/month y el JS del calendario</w:t>
             </w:r>
           </w:p>
         </w:tc>
@@ -9822,7 +10021,7 @@
                 <w:color w:val="000000"/>
                 <w:sz w:val="17"/>
               </w:rPr>
-              <w:t>Todo correcto (capturas en docs/evidencias/HU-02_*.png). La validación formal la hace Kelvin (QA)</w:t>
+              <w:t>La lógica reutiliza generate_slots y es consistente con la lista de horarios; en el front, al cambiar de mes quedan visibles los horarios del día elegido en el mes anterior</w:t>
             </w:r>
           </w:p>
         </w:tc>
@@ -9841,7 +10040,7 @@
                 <w:color w:val="000000"/>
                 <w:sz w:val="17"/>
               </w:rPr>
-              <w:t>Aceptada</w:t>
+              <w:t>Aceptada con una observación (comentada en el PR #12)</w:t>
             </w:r>
           </w:p>
         </w:tc>
@@ -9865,7 +10064,7 @@
                 <w:color w:val="000000"/>
                 <w:sz w:val="17"/>
               </w:rPr>
-              <w:t>Arquitectura (HU-05, Roy)</w:t>
+              <w:t>Arquitectura (HU-02, Roy)</w:t>
             </w:r>
           </w:p>
         </w:tc>
@@ -9903,7 +10102,7 @@
                 <w:color w:val="000000"/>
                 <w:sz w:val="17"/>
               </w:rPr>
-              <w:t>Analizar crud.list_appointments, routers/admin.py y admin.html antes de programar</w:t>
+              <w:t>Analizar availability.py, routers/public.py, index.html y las ramas abiertas (HU-01, HU-03, HU-04, fix) antes de programar</w:t>
             </w:r>
           </w:p>
         </w:tc>
@@ -9922,7 +10121,7 @@
                 <w:color w:val="000000"/>
                 <w:sz w:val="17"/>
               </w:rPr>
-              <w:t>Propuso ampliar list_appointments con un rango date_from/date_to (sin romper el filtro date del panel) y un módulo export.py aparte</w:t>
+              <w:t>Propuso reutilizar generate_slots día por día; detectó que HU-04 cambia la firma de generate_slots y el import de public.py (riesgo de conflicto)</w:t>
             </w:r>
           </w:p>
         </w:tc>
@@ -9965,6 +10164,506 @@
                 <w:color w:val="000000"/>
                 <w:sz w:val="17"/>
               </w:rPr>
+              <w:t>Código (HU-02, Roy)</w:t>
+            </w:r>
+          </w:p>
+        </w:tc>
+        <w:tc>
+          <w:tcPr>
+            <w:tcW w:w="1300" w:type="dxa"/>
+            <w:vAlign w:val="center"/>
+          </w:tcPr>
+          <w:p>
+            <w:pPr>
+              <w:spacing w:after="40" w:line="252" w:lineRule="auto"/>
+            </w:pPr>
+            <w:r>
+              <w:rPr>
+                <w:i w:val="0"/>
+                <w:color w:val="000000"/>
+                <w:sz w:val="17"/>
+              </w:rPr>
+              <w:t>Claude Code (Claude Opus 5.5)</w:t>
+            </w:r>
+          </w:p>
+        </w:tc>
+        <w:tc>
+          <w:tcPr>
+            <w:tcW w:w="2300" w:type="dxa"/>
+            <w:vAlign w:val="center"/>
+          </w:tcPr>
+          <w:p>
+            <w:pPr>
+              <w:spacing w:after="40" w:line="252" w:lineRule="auto"/>
+            </w:pPr>
+            <w:r>
+              <w:rPr>
+                <w:i w:val="0"/>
+                <w:color w:val="000000"/>
+                <w:sz w:val="17"/>
+              </w:rPr>
+              <w:t>Endpoint GET /api/availability/month?service_id=&amp;month=YYYY-MM con el estado de cada día</w:t>
+            </w:r>
+          </w:p>
+        </w:tc>
+        <w:tc>
+          <w:tcPr>
+            <w:tcW w:w="2200" w:type="dxa"/>
+            <w:vAlign w:val="center"/>
+          </w:tcPr>
+          <w:p>
+            <w:pPr>
+              <w:spacing w:after="40" w:line="252" w:lineRule="auto"/>
+            </w:pPr>
+            <w:r>
+              <w:rPr>
+                <w:i w:val="0"/>
+                <w:color w:val="000000"/>
+                <w:sz w:val="17"/>
+              </w:rPr>
+              <w:t>month_availability() en availability.py, esquema DayAvailabilityOut, validación del mes con regex (422) y 404 para servicio inactivo</w:t>
+            </w:r>
+          </w:p>
+        </w:tc>
+        <w:tc>
+          <w:tcPr>
+            <w:tcW w:w="2360" w:type="dxa"/>
+            <w:vAlign w:val="center"/>
+          </w:tcPr>
+          <w:p>
+            <w:pPr>
+              <w:spacing w:after="40" w:line="252" w:lineRule="auto"/>
+            </w:pPr>
+            <w:r>
+              <w:rPr>
+                <w:i w:val="0"/>
+                <w:color w:val="000000"/>
+                <w:sz w:val="17"/>
+              </w:rPr>
+              <w:t>Aceptada; aprobada por Einer con observaciones (PR #12)</w:t>
+            </w:r>
+          </w:p>
+        </w:tc>
+      </w:tr>
+      <w:tr>
+        <w:trPr>
+          <w:cantSplit/>
+        </w:trPr>
+        <w:tc>
+          <w:tcPr>
+            <w:tcW w:w="1200" w:type="dxa"/>
+            <w:vAlign w:val="center"/>
+          </w:tcPr>
+          <w:p>
+            <w:pPr>
+              <w:spacing w:after="40" w:line="252" w:lineRule="auto"/>
+            </w:pPr>
+            <w:r>
+              <w:rPr>
+                <w:i w:val="0"/>
+                <w:color w:val="000000"/>
+                <w:sz w:val="17"/>
+              </w:rPr>
+              <w:t>Código (HU-02, Roy)</w:t>
+            </w:r>
+          </w:p>
+        </w:tc>
+        <w:tc>
+          <w:tcPr>
+            <w:tcW w:w="1300" w:type="dxa"/>
+            <w:vAlign w:val="center"/>
+          </w:tcPr>
+          <w:p>
+            <w:pPr>
+              <w:spacing w:after="40" w:line="252" w:lineRule="auto"/>
+            </w:pPr>
+            <w:r>
+              <w:rPr>
+                <w:i w:val="0"/>
+                <w:color w:val="000000"/>
+                <w:sz w:val="17"/>
+              </w:rPr>
+              <w:t>Claude Code (Claude Opus 5.5)</w:t>
+            </w:r>
+          </w:p>
+        </w:tc>
+        <w:tc>
+          <w:tcPr>
+            <w:tcW w:w="2300" w:type="dxa"/>
+            <w:vAlign w:val="center"/>
+          </w:tcPr>
+          <w:p>
+            <w:pPr>
+              <w:spacing w:after="40" w:line="252" w:lineRule="auto"/>
+            </w:pPr>
+            <w:r>
+              <w:rPr>
+                <w:i w:val="0"/>
+                <w:color w:val="000000"/>
+                <w:sz w:val="17"/>
+              </w:rPr>
+              <w:t>Reemplazar el &lt;input type="date"&gt; por un calendario mensual</w:t>
+            </w:r>
+          </w:p>
+        </w:tc>
+        <w:tc>
+          <w:tcPr>
+            <w:tcW w:w="2200" w:type="dxa"/>
+            <w:vAlign w:val="center"/>
+          </w:tcPr>
+          <w:p>
+            <w:pPr>
+              <w:spacing w:after="40" w:line="252" w:lineRule="auto"/>
+            </w:pPr>
+            <w:r>
+              <w:rPr>
+                <w:i w:val="0"/>
+                <w:color w:val="000000"/>
+                <w:sz w:val="17"/>
+              </w:rPr>
+              <w:t>Calendario lunes-domingo con días disponibles (verde), ocupados (rojo, tachado) y cerrados/pasados (gris); solo los disponibles son clicables</w:t>
+            </w:r>
+          </w:p>
+        </w:tc>
+        <w:tc>
+          <w:tcPr>
+            <w:tcW w:w="2360" w:type="dxa"/>
+            <w:vAlign w:val="center"/>
+          </w:tcPr>
+          <w:p>
+            <w:pPr>
+              <w:spacing w:after="40" w:line="252" w:lineRule="auto"/>
+            </w:pPr>
+            <w:r>
+              <w:rPr>
+                <w:i w:val="0"/>
+                <w:color w:val="000000"/>
+                <w:sz w:val="17"/>
+              </w:rPr>
+              <w:t>Aceptada tras corregir los errores 3 y 4 de la sección 7</w:t>
+            </w:r>
+          </w:p>
+        </w:tc>
+      </w:tr>
+      <w:tr>
+        <w:trPr>
+          <w:cantSplit/>
+        </w:trPr>
+        <w:tc>
+          <w:tcPr>
+            <w:tcW w:w="1200" w:type="dxa"/>
+            <w:vAlign w:val="center"/>
+          </w:tcPr>
+          <w:p>
+            <w:pPr>
+              <w:spacing w:after="40" w:line="252" w:lineRule="auto"/>
+            </w:pPr>
+            <w:r>
+              <w:rPr>
+                <w:i w:val="0"/>
+                <w:color w:val="000000"/>
+                <w:sz w:val="17"/>
+              </w:rPr>
+              <w:t>Testing (HU-02, Roy)</w:t>
+            </w:r>
+          </w:p>
+        </w:tc>
+        <w:tc>
+          <w:tcPr>
+            <w:tcW w:w="1300" w:type="dxa"/>
+            <w:vAlign w:val="center"/>
+          </w:tcPr>
+          <w:p>
+            <w:pPr>
+              <w:spacing w:after="40" w:line="252" w:lineRule="auto"/>
+            </w:pPr>
+            <w:r>
+              <w:rPr>
+                <w:i w:val="0"/>
+                <w:color w:val="000000"/>
+                <w:sz w:val="17"/>
+              </w:rPr>
+              <w:t>Claude Code (Claude Opus 5.5)</w:t>
+            </w:r>
+          </w:p>
+        </w:tc>
+        <w:tc>
+          <w:tcPr>
+            <w:tcW w:w="2300" w:type="dxa"/>
+            <w:vAlign w:val="center"/>
+          </w:tcPr>
+          <w:p>
+            <w:pPr>
+              <w:spacing w:after="40" w:line="252" w:lineRule="auto"/>
+            </w:pPr>
+            <w:r>
+              <w:rPr>
+                <w:i w:val="0"/>
+                <w:color w:val="000000"/>
+                <w:sz w:val="17"/>
+              </w:rPr>
+              <w:t>Crear pruebas automatizadas de la historia</w:t>
+            </w:r>
+          </w:p>
+        </w:tc>
+        <w:tc>
+          <w:tcPr>
+            <w:tcW w:w="2200" w:type="dxa"/>
+            <w:vAlign w:val="center"/>
+          </w:tcPr>
+          <w:p>
+            <w:pPr>
+              <w:spacing w:after="40" w:line="252" w:lineRule="auto"/>
+            </w:pPr>
+            <w:r>
+              <w:rPr>
+                <w:i w:val="0"/>
+                <w:color w:val="000000"/>
+                <w:sz w:val="17"/>
+              </w:rPr>
+              <w:t>test_calendar.py: 14 pruebas (incluye mes bisiesto, día lleno, cita cancelada que no bloquea y formatos de mes inválidos); suite en 20/20</w:t>
+            </w:r>
+          </w:p>
+        </w:tc>
+        <w:tc>
+          <w:tcPr>
+            <w:tcW w:w="2360" w:type="dxa"/>
+            <w:vAlign w:val="center"/>
+          </w:tcPr>
+          <w:p>
+            <w:pPr>
+              <w:spacing w:after="40" w:line="252" w:lineRule="auto"/>
+            </w:pPr>
+            <w:r>
+              <w:rPr>
+                <w:i w:val="0"/>
+                <w:color w:val="000000"/>
+                <w:sz w:val="17"/>
+              </w:rPr>
+              <w:t>Aceptada</w:t>
+            </w:r>
+          </w:p>
+        </w:tc>
+      </w:tr>
+      <w:tr>
+        <w:trPr>
+          <w:cantSplit/>
+        </w:trPr>
+        <w:tc>
+          <w:tcPr>
+            <w:tcW w:w="1200" w:type="dxa"/>
+            <w:vAlign w:val="center"/>
+          </w:tcPr>
+          <w:p>
+            <w:pPr>
+              <w:spacing w:after="40" w:line="252" w:lineRule="auto"/>
+            </w:pPr>
+            <w:r>
+              <w:rPr>
+                <w:i w:val="0"/>
+                <w:color w:val="000000"/>
+                <w:sz w:val="17"/>
+              </w:rPr>
+              <w:t>Testing (pre-chequeo del Developer) (HU-02, Roy)</w:t>
+            </w:r>
+          </w:p>
+        </w:tc>
+        <w:tc>
+          <w:tcPr>
+            <w:tcW w:w="1300" w:type="dxa"/>
+            <w:vAlign w:val="center"/>
+          </w:tcPr>
+          <w:p>
+            <w:pPr>
+              <w:spacing w:after="40" w:line="252" w:lineRule="auto"/>
+            </w:pPr>
+            <w:r>
+              <w:rPr>
+                <w:i w:val="0"/>
+                <w:color w:val="000000"/>
+                <w:sz w:val="17"/>
+              </w:rPr>
+              <w:t>Claude Code (Claude Opus 5.5) + Playwright</w:t>
+            </w:r>
+          </w:p>
+        </w:tc>
+        <w:tc>
+          <w:tcPr>
+            <w:tcW w:w="2300" w:type="dxa"/>
+            <w:vAlign w:val="center"/>
+          </w:tcPr>
+          <w:p>
+            <w:pPr>
+              <w:spacing w:after="40" w:line="252" w:lineRule="auto"/>
+            </w:pPr>
+            <w:r>
+              <w:rPr>
+                <w:i w:val="0"/>
+                <w:color w:val="000000"/>
+                <w:sz w:val="17"/>
+              </w:rPr>
+              <w:t>Probar en navegador: estados del mes, clic en día lleno, navegación de meses, cambio de servicio y vista móvil</w:t>
+            </w:r>
+          </w:p>
+        </w:tc>
+        <w:tc>
+          <w:tcPr>
+            <w:tcW w:w="2200" w:type="dxa"/>
+            <w:vAlign w:val="center"/>
+          </w:tcPr>
+          <w:p>
+            <w:pPr>
+              <w:spacing w:after="40" w:line="252" w:lineRule="auto"/>
+            </w:pPr>
+            <w:r>
+              <w:rPr>
+                <w:i w:val="0"/>
+                <w:color w:val="000000"/>
+                <w:sz w:val="17"/>
+              </w:rPr>
+              <w:t>Todo correcto (capturas en docs/evidencias/HU-02_*.png). La validación formal la hace Kelvin (QA)</w:t>
+            </w:r>
+          </w:p>
+        </w:tc>
+        <w:tc>
+          <w:tcPr>
+            <w:tcW w:w="2360" w:type="dxa"/>
+            <w:vAlign w:val="center"/>
+          </w:tcPr>
+          <w:p>
+            <w:pPr>
+              <w:spacing w:after="40" w:line="252" w:lineRule="auto"/>
+            </w:pPr>
+            <w:r>
+              <w:rPr>
+                <w:i w:val="0"/>
+                <w:color w:val="000000"/>
+                <w:sz w:val="17"/>
+              </w:rPr>
+              <w:t>Aceptada</w:t>
+            </w:r>
+          </w:p>
+        </w:tc>
+      </w:tr>
+      <w:tr>
+        <w:trPr>
+          <w:cantSplit/>
+        </w:trPr>
+        <w:tc>
+          <w:tcPr>
+            <w:tcW w:w="1200" w:type="dxa"/>
+            <w:vAlign w:val="center"/>
+          </w:tcPr>
+          <w:p>
+            <w:pPr>
+              <w:spacing w:after="40" w:line="252" w:lineRule="auto"/>
+            </w:pPr>
+            <w:r>
+              <w:rPr>
+                <w:i w:val="0"/>
+                <w:color w:val="000000"/>
+                <w:sz w:val="17"/>
+              </w:rPr>
+              <w:t>Arquitectura (HU-05, Roy)</w:t>
+            </w:r>
+          </w:p>
+        </w:tc>
+        <w:tc>
+          <w:tcPr>
+            <w:tcW w:w="1300" w:type="dxa"/>
+            <w:vAlign w:val="center"/>
+          </w:tcPr>
+          <w:p>
+            <w:pPr>
+              <w:spacing w:after="40" w:line="252" w:lineRule="auto"/>
+            </w:pPr>
+            <w:r>
+              <w:rPr>
+                <w:i w:val="0"/>
+                <w:color w:val="000000"/>
+                <w:sz w:val="17"/>
+              </w:rPr>
+              <w:t>Claude Code (Claude Opus 5.5)</w:t>
+            </w:r>
+          </w:p>
+        </w:tc>
+        <w:tc>
+          <w:tcPr>
+            <w:tcW w:w="2300" w:type="dxa"/>
+            <w:vAlign w:val="center"/>
+          </w:tcPr>
+          <w:p>
+            <w:pPr>
+              <w:spacing w:after="40" w:line="252" w:lineRule="auto"/>
+            </w:pPr>
+            <w:r>
+              <w:rPr>
+                <w:i w:val="0"/>
+                <w:color w:val="000000"/>
+                <w:sz w:val="17"/>
+              </w:rPr>
+              <w:t>Analizar crud.list_appointments, routers/admin.py y admin.html antes de programar</w:t>
+            </w:r>
+          </w:p>
+        </w:tc>
+        <w:tc>
+          <w:tcPr>
+            <w:tcW w:w="2200" w:type="dxa"/>
+            <w:vAlign w:val="center"/>
+          </w:tcPr>
+          <w:p>
+            <w:pPr>
+              <w:spacing w:after="40" w:line="252" w:lineRule="auto"/>
+            </w:pPr>
+            <w:r>
+              <w:rPr>
+                <w:i w:val="0"/>
+                <w:color w:val="000000"/>
+                <w:sz w:val="17"/>
+              </w:rPr>
+              <w:t>Propuso ampliar list_appointments con un rango date_from/date_to (sin romper el filtro date del panel) y un módulo export.py aparte</w:t>
+            </w:r>
+          </w:p>
+        </w:tc>
+        <w:tc>
+          <w:tcPr>
+            <w:tcW w:w="2360" w:type="dxa"/>
+            <w:vAlign w:val="center"/>
+          </w:tcPr>
+          <w:p>
+            <w:pPr>
+              <w:spacing w:after="40" w:line="252" w:lineRule="auto"/>
+            </w:pPr>
+            <w:r>
+              <w:rPr>
+                <w:i w:val="0"/>
+                <w:color w:val="000000"/>
+                <w:sz w:val="17"/>
+              </w:rPr>
+              <w:t>Aceptada</w:t>
+            </w:r>
+          </w:p>
+        </w:tc>
+      </w:tr>
+      <w:tr>
+        <w:trPr>
+          <w:cantSplit/>
+        </w:trPr>
+        <w:tc>
+          <w:tcPr>
+            <w:tcW w:w="1200" w:type="dxa"/>
+            <w:vAlign w:val="center"/>
+          </w:tcPr>
+          <w:p>
+            <w:pPr>
+              <w:spacing w:after="40" w:line="252" w:lineRule="auto"/>
+            </w:pPr>
+            <w:r>
+              <w:rPr>
+                <w:i w:val="0"/>
+                <w:color w:val="000000"/>
+                <w:sz w:val="17"/>
+              </w:rPr>
               <w:t>Código (HU-05, Roy)</w:t>
             </w:r>
           </w:p>
@@ -10041,7 +10740,7 @@
                 <w:color w:val="000000"/>
                 <w:sz w:val="17"/>
               </w:rPr>
-              <w:t>Aceptada; pendiente de revisión por Einer</w:t>
+              <w:t>Aceptada; aprobada por Einer con observaciones (PR #13)</w:t>
             </w:r>
           </w:p>
         </w:tc>
@@ -10866,6 +11565,125 @@
                 <w:color w:val="000000"/>
                 <w:sz w:val="17"/>
               </w:rPr>
+              <w:t>Claude Code (Claude Sonnet 5.5)</w:t>
+            </w:r>
+          </w:p>
+        </w:tc>
+        <w:tc>
+          <w:tcPr>
+            <w:tcW w:w="1900" w:type="dxa"/>
+            <w:vAlign w:val="center"/>
+          </w:tcPr>
+          <w:p>
+            <w:pPr>
+              <w:spacing w:after="40" w:line="252" w:lineRule="auto"/>
+            </w:pPr>
+            <w:r>
+              <w:rPr>
+                <w:i w:val="0"/>
+                <w:color w:val="000000"/>
+                <w:sz w:val="17"/>
+              </w:rPr>
+              <w:t>HU-03: Prueba de autenticación del endpoint de previsión</w:t>
+            </w:r>
+          </w:p>
+        </w:tc>
+        <w:tc>
+          <w:tcPr>
+            <w:tcW w:w="2260" w:type="dxa"/>
+            <w:vAlign w:val="center"/>
+          </w:tcPr>
+          <w:p>
+            <w:pPr>
+              <w:spacing w:after="40" w:line="252" w:lineRule="auto"/>
+            </w:pPr>
+            <w:r>
+              <w:rPr>
+                <w:i w:val="0"/>
+                <w:color w:val="000000"/>
+                <w:sz w:val="17"/>
+              </w:rPr>
+              <w:t>Escribió la prueba esperando 401 al llamar sin la cabecera X-Admin-Token; en este repo falta la cabecera da 422 y solo el token incorrecto da 401</w:t>
+            </w:r>
+          </w:p>
+        </w:tc>
+        <w:tc>
+          <w:tcPr>
+            <w:tcW w:w="1700" w:type="dxa"/>
+            <w:vAlign w:val="center"/>
+          </w:tcPr>
+          <w:p>
+            <w:pPr>
+              <w:spacing w:after="40" w:line="252" w:lineRule="auto"/>
+            </w:pPr>
+            <w:r>
+              <w:rPr>
+                <w:i w:val="0"/>
+                <w:color w:val="000000"/>
+                <w:sz w:val="17"/>
+              </w:rPr>
+              <w:t>Falló al correr pytest y se comparó con test_admin_auth de test_booking.py</w:t>
+            </w:r>
+          </w:p>
+        </w:tc>
+        <w:tc>
+          <w:tcPr>
+            <w:tcW w:w="1700" w:type="dxa"/>
+            <w:vAlign w:val="center"/>
+          </w:tcPr>
+          <w:p>
+            <w:pPr>
+              <w:spacing w:after="40" w:line="252" w:lineRule="auto"/>
+            </w:pPr>
+            <w:r>
+              <w:rPr>
+                <w:i w:val="0"/>
+                <w:color w:val="000000"/>
+                <w:sz w:val="17"/>
+              </w:rPr>
+              <w:t>Se corrigió la prueba: 422 sin cabecera y 401 con token incorrecto</w:t>
+            </w:r>
+          </w:p>
+        </w:tc>
+      </w:tr>
+      <w:tr>
+        <w:trPr>
+          <w:cantSplit/>
+        </w:trPr>
+        <w:tc>
+          <w:tcPr>
+            <w:tcW w:w="500" w:type="dxa"/>
+            <w:vAlign w:val="center"/>
+          </w:tcPr>
+          <w:p>
+            <w:pPr>
+              <w:spacing w:after="40" w:line="252" w:lineRule="auto"/>
+            </w:pPr>
+            <w:r>
+              <w:rPr>
+                <w:i w:val="0"/>
+                <w:color w:val="000000"/>
+                <w:sz w:val="17"/>
+              </w:rPr>
+              <w:t>5</w:t>
+            </w:r>
+          </w:p>
+        </w:tc>
+        <w:tc>
+          <w:tcPr>
+            <w:tcW w:w="1300" w:type="dxa"/>
+            <w:vAlign w:val="center"/>
+          </w:tcPr>
+          <w:p>
+            <w:pPr>
+              <w:spacing w:after="40" w:line="252" w:lineRule="auto"/>
+            </w:pPr>
+            <w:r>
+              <w:rPr>
+                <w:i w:val="0"/>
+                <w:color w:val="000000"/>
+                <w:sz w:val="17"/>
+              </w:rPr>
               <w:t>Claude Code (Claude Opus 5.5)</w:t>
             </w:r>
           </w:p>
@@ -11144,7 +11962,7 @@
                 <w:color w:val="000000"/>
                 <w:sz w:val="17"/>
               </w:rPr>
-              <w:t>2</w:t>
+              <w:t>1</w:t>
             </w:r>
           </w:p>
         </w:tc>
@@ -11201,7 +12019,7 @@
                 <w:color w:val="000000"/>
                 <w:sz w:val="17"/>
               </w:rPr>
-              <w:t>date | None (válido con from __future__ import annotations) y el import nuevo en su propia línea; el merge con las demás ramas queda limpio</w:t>
+              <w:t>date | None (válido con from __future__ import annotations) y el import nuevo en su propia línea; el merge de prueba con HU-01, HU-03, HU-04 y el fix queda limpio</w:t>
             </w:r>
           </w:p>
         </w:tc>
@@ -12236,7 +13054,7 @@
                 <w:color w:val="000000"/>
                 <w:sz w:val="17"/>
               </w:rPr>
-              <w:t>Roy (Developer, con IA); pendiente de confirmar por Einer</w:t>
+              <w:t>Roy (Developer, con IA); revisión aprobada por Einer (PR #12)</w:t>
             </w:r>
           </w:p>
         </w:tc>
@@ -12336,7 +13154,7 @@
                 <w:color w:val="000000"/>
                 <w:sz w:val="17"/>
               </w:rPr>
-              <w:t>Roy (Developer, con IA); pendiente de confirmar por Einer</w:t>
+              <w:t>Roy (Developer, con IA); revisión aprobada por Einer (PR #12)</w:t>
             </w:r>
           </w:p>
         </w:tc>
@@ -12436,7 +13254,7 @@
                 <w:color w:val="000000"/>
                 <w:sz w:val="17"/>
               </w:rPr>
-              <w:t>Roy (Developer, con IA); pendiente de confirmar por Einer</w:t>
+              <w:t>Roy (Developer, con IA); revisión aprobada por Einer (PR #12)</w:t>
             </w:r>
           </w:p>
         </w:tc>
@@ -12536,7 +13354,7 @@
                 <w:color w:val="000000"/>
                 <w:sz w:val="17"/>
               </w:rPr>
-              <w:t>Roy (Developer, con IA); pendiente de confirmar por Einer</w:t>
+              <w:t>Roy (Developer, con IA); revisión aprobada por Einer (PR #13)</w:t>
             </w:r>
           </w:p>
         </w:tc>
@@ -12636,7 +13454,7 @@
                 <w:color w:val="000000"/>
                 <w:sz w:val="17"/>
               </w:rPr>
-              <w:t>Roy (Developer, con IA); pendiente de confirmar por Einer</w:t>
+              <w:t>Roy (Developer, con IA); revisión aprobada por Einer (PR #13)</w:t>
             </w:r>
           </w:p>
         </w:tc>
@@ -12736,7 +13554,7 @@
                 <w:color w:val="000000"/>
                 <w:sz w:val="17"/>
               </w:rPr>
-              <w:t>Roy (Developer, con IA); pendiente de confirmar por Einer</w:t>
+              <w:t>Roy (Developer, con IA); revisión aprobada por Einer (PR #13)</w:t>
             </w:r>
           </w:p>
         </w:tc>
@@ -12836,7 +13654,7 @@
                 <w:color w:val="000000"/>
                 <w:sz w:val="17"/>
               </w:rPr>
-              <w:t>Roy (Developer, con IA); pendiente de confirmar por Einer</w:t>
+              <w:t>Roy (Developer, con IA); revisión aprobada por Einer (PR #13)</w:t>
             </w:r>
           </w:p>
         </w:tc>
@@ -12856,6 +13674,306 @@
                 <w:sz w:val="17"/>
               </w:rPr>
               <w:t>La tabla appointments no guarda el precio y el repo no tiene migraciones; queda como limitación conocida</w:t>
+            </w:r>
+          </w:p>
+        </w:tc>
+      </w:tr>
+      <w:tr>
+        <w:trPr>
+          <w:cantSplit/>
+        </w:trPr>
+        <w:tc>
+          <w:tcPr>
+            <w:tcW w:w="500" w:type="dxa"/>
+            <w:vAlign w:val="center"/>
+          </w:tcPr>
+          <w:p>
+            <w:pPr>
+              <w:spacing w:after="40" w:line="252" w:lineRule="auto"/>
+            </w:pPr>
+            <w:r>
+              <w:rPr>
+                <w:i w:val="0"/>
+                <w:color w:val="000000"/>
+                <w:sz w:val="17"/>
+              </w:rPr>
+              <w:t>16</w:t>
+            </w:r>
+          </w:p>
+        </w:tc>
+        <w:tc>
+          <w:tcPr>
+            <w:tcW w:w="2800" w:type="dxa"/>
+            <w:vAlign w:val="center"/>
+          </w:tcPr>
+          <w:p>
+            <w:pPr>
+              <w:spacing w:after="40" w:line="252" w:lineRule="auto"/>
+            </w:pPr>
+            <w:r>
+              <w:rPr>
+                <w:i w:val="0"/>
+                <w:color w:val="000000"/>
+                <w:sz w:val="17"/>
+              </w:rPr>
+              <w:t>Pronóstico = promedio de reservas del mismo día de la semana en el histórico (56 días por defecto)</w:t>
+            </w:r>
+          </w:p>
+        </w:tc>
+        <w:tc>
+          <w:tcPr>
+            <w:tcW w:w="2260" w:type="dxa"/>
+            <w:vAlign w:val="center"/>
+          </w:tcPr>
+          <w:p>
+            <w:pPr>
+              <w:spacing w:after="40" w:line="252" w:lineRule="auto"/>
+            </w:pPr>
+            <w:r>
+              <w:rPr>
+                <w:i w:val="0"/>
+                <w:color w:val="000000"/>
+                <w:sz w:val="17"/>
+              </w:rPr>
+              <w:t>Regresión lineal o suavizado exponencial</w:t>
+            </w:r>
+          </w:p>
+        </w:tc>
+        <w:tc>
+          <w:tcPr>
+            <w:tcW w:w="1600" w:type="dxa"/>
+            <w:vAlign w:val="center"/>
+          </w:tcPr>
+          <w:p>
+            <w:pPr>
+              <w:spacing w:after="40" w:line="252" w:lineRule="auto"/>
+            </w:pPr>
+            <w:r>
+              <w:rPr>
+                <w:i w:val="0"/>
+                <w:color w:val="000000"/>
+                <w:sz w:val="17"/>
+              </w:rPr>
+              <w:t>Propuesta de la IA (HU-03), aceptada por Einer</w:t>
+            </w:r>
+          </w:p>
+        </w:tc>
+        <w:tc>
+          <w:tcPr>
+            <w:tcW w:w="2200" w:type="dxa"/>
+            <w:vAlign w:val="center"/>
+          </w:tcPr>
+          <w:p>
+            <w:pPr>
+              <w:spacing w:after="40" w:line="252" w:lineRule="auto"/>
+            </w:pPr>
+            <w:r>
+              <w:rPr>
+                <w:i w:val="0"/>
+                <w:color w:val="000000"/>
+                <w:sz w:val="17"/>
+              </w:rPr>
+              <w:t>Con pocos datos y semanas con cierres (domingo) un promedio por día de la semana es explicable y fácil de probar</w:t>
+            </w:r>
+          </w:p>
+        </w:tc>
+      </w:tr>
+      <w:tr>
+        <w:trPr>
+          <w:cantSplit/>
+        </w:trPr>
+        <w:tc>
+          <w:tcPr>
+            <w:tcW w:w="500" w:type="dxa"/>
+            <w:vAlign w:val="center"/>
+          </w:tcPr>
+          <w:p>
+            <w:pPr>
+              <w:spacing w:after="40" w:line="252" w:lineRule="auto"/>
+            </w:pPr>
+            <w:r>
+              <w:rPr>
+                <w:i w:val="0"/>
+                <w:color w:val="000000"/>
+                <w:sz w:val="17"/>
+              </w:rPr>
+              <w:t>17</w:t>
+            </w:r>
+          </w:p>
+        </w:tc>
+        <w:tc>
+          <w:tcPr>
+            <w:tcW w:w="2800" w:type="dxa"/>
+            <w:vAlign w:val="center"/>
+          </w:tcPr>
+          <w:p>
+            <w:pPr>
+              <w:spacing w:after="40" w:line="252" w:lineRule="auto"/>
+            </w:pPr>
+            <w:r>
+              <w:rPr>
+                <w:i w:val="0"/>
+                <w:color w:val="000000"/>
+                <w:sz w:val="17"/>
+              </w:rPr>
+              <w:t>Las citas canceladas no cuentan como demanda</w:t>
+            </w:r>
+          </w:p>
+        </w:tc>
+        <w:tc>
+          <w:tcPr>
+            <w:tcW w:w="2260" w:type="dxa"/>
+            <w:vAlign w:val="center"/>
+          </w:tcPr>
+          <w:p>
+            <w:pPr>
+              <w:spacing w:after="40" w:line="252" w:lineRule="auto"/>
+            </w:pPr>
+            <w:r>
+              <w:rPr>
+                <w:i w:val="0"/>
+                <w:color w:val="000000"/>
+                <w:sz w:val="17"/>
+              </w:rPr>
+              <w:t>Contarlas</w:t>
+            </w:r>
+          </w:p>
+        </w:tc>
+        <w:tc>
+          <w:tcPr>
+            <w:tcW w:w="1600" w:type="dxa"/>
+            <w:vAlign w:val="center"/>
+          </w:tcPr>
+          <w:p>
+            <w:pPr>
+              <w:spacing w:after="40" w:line="252" w:lineRule="auto"/>
+            </w:pPr>
+            <w:r>
+              <w:rPr>
+                <w:i w:val="0"/>
+                <w:color w:val="000000"/>
+                <w:sz w:val="17"/>
+              </w:rPr>
+              <w:t>Propuesta de la IA (HU-03), aceptada por Einer</w:t>
+            </w:r>
+          </w:p>
+        </w:tc>
+        <w:tc>
+          <w:tcPr>
+            <w:tcW w:w="2200" w:type="dxa"/>
+            <w:vAlign w:val="center"/>
+          </w:tcPr>
+          <w:p>
+            <w:pPr>
+              <w:spacing w:after="40" w:line="252" w:lineRule="auto"/>
+            </w:pPr>
+            <w:r>
+              <w:rPr>
+                <w:i w:val="0"/>
+                <w:color w:val="000000"/>
+                <w:sz w:val="17"/>
+              </w:rPr>
+              <w:t>Una cita cancelada no consumió capacidad ni ingreso</w:t>
+            </w:r>
+          </w:p>
+        </w:tc>
+      </w:tr>
+      <w:tr>
+        <w:trPr>
+          <w:cantSplit/>
+        </w:trPr>
+        <w:tc>
+          <w:tcPr>
+            <w:tcW w:w="500" w:type="dxa"/>
+            <w:vAlign w:val="center"/>
+          </w:tcPr>
+          <w:p>
+            <w:pPr>
+              <w:spacing w:after="40" w:line="252" w:lineRule="auto"/>
+            </w:pPr>
+            <w:r>
+              <w:rPr>
+                <w:i w:val="0"/>
+                <w:color w:val="000000"/>
+                <w:sz w:val="17"/>
+              </w:rPr>
+              <w:t>18</w:t>
+            </w:r>
+          </w:p>
+        </w:tc>
+        <w:tc>
+          <w:tcPr>
+            <w:tcW w:w="2800" w:type="dxa"/>
+            <w:vAlign w:val="center"/>
+          </w:tcPr>
+          <w:p>
+            <w:pPr>
+              <w:spacing w:after="40" w:line="252" w:lineRule="auto"/>
+            </w:pPr>
+            <w:r>
+              <w:rPr>
+                <w:i w:val="0"/>
+                <w:color w:val="000000"/>
+                <w:sz w:val="17"/>
+              </w:rPr>
+              <w:t>Gráficos de barras con HTML/CSS, sin librería de gráficos</w:t>
+            </w:r>
+          </w:p>
+        </w:tc>
+        <w:tc>
+          <w:tcPr>
+            <w:tcW w:w="2260" w:type="dxa"/>
+            <w:vAlign w:val="center"/>
+          </w:tcPr>
+          <w:p>
+            <w:pPr>
+              <w:spacing w:after="40" w:line="252" w:lineRule="auto"/>
+            </w:pPr>
+            <w:r>
+              <w:rPr>
+                <w:i w:val="0"/>
+                <w:color w:val="000000"/>
+                <w:sz w:val="17"/>
+              </w:rPr>
+              <w:t>Chart.js desde CDN</w:t>
+            </w:r>
+          </w:p>
+        </w:tc>
+        <w:tc>
+          <w:tcPr>
+            <w:tcW w:w="1600" w:type="dxa"/>
+            <w:vAlign w:val="center"/>
+          </w:tcPr>
+          <w:p>
+            <w:pPr>
+              <w:spacing w:after="40" w:line="252" w:lineRule="auto"/>
+            </w:pPr>
+            <w:r>
+              <w:rPr>
+                <w:i w:val="0"/>
+                <w:color w:val="000000"/>
+                <w:sz w:val="17"/>
+              </w:rPr>
+              <w:t>Propuesta de la IA (HU-03), aceptada por Einer</w:t>
+            </w:r>
+          </w:p>
+        </w:tc>
+        <w:tc>
+          <w:tcPr>
+            <w:tcW w:w="2200" w:type="dxa"/>
+            <w:vAlign w:val="center"/>
+          </w:tcPr>
+          <w:p>
+            <w:pPr>
+              <w:spacing w:after="40" w:line="252" w:lineRule="auto"/>
+            </w:pPr>
+            <w:r>
+              <w:rPr>
+                <w:i w:val="0"/>
+                <w:color w:val="000000"/>
+                <w:sz w:val="17"/>
+              </w:rPr>
+              <w:t>Cumple la regla de no agregar dependencias que nadie pidió</w:t>
             </w:r>
           </w:p>
         </w:tc>
@@ -13630,7 +14748,7 @@
                 <w:color w:val="000000"/>
                 <w:sz w:val="17"/>
               </w:rPr>
-              <w:t>☑ (3 de 7 PR con revisión formal)</w:t>
+              <w:t>☑ (5 de 9 PR con revisión registrada)</w:t>
             </w:r>
           </w:p>
         </w:tc>

</xml_diff>

<commit_message>
Evidencias: suma el PR #16 (10 PR) en Word y presentación
Co-Authored-By: Claude Sonnet 5.5 <noreply@anthropic.com>
</commit_message>
<xml_diff>
--- a/docs/1GS242_Proyecto1_Evidencias_IA.docx
+++ b/docs/1GS242_Proyecto1_Evidencias_IA.docx
@@ -4283,7 +4283,7 @@
         <w:jc w:val="both"/>
       </w:pPr>
       <w:r>
-        <w:t>Repositorio del grupo: https://github.com/kelvinhe04/citafacil (público). Se clonó gianca675/citafacil (licencia MIT, se conserva su crédito y su historial) y se subió a un repositorio propio. En total: 5 issues de historias de usuario y 9 Pull Requests, todos fusionados en main.</w:t>
+        <w:t>Repositorio del grupo: https://github.com/kelvinhe04/citafacil (público). Se clonó gianca675/citafacil (licencia MIT, se conserva su crédito y su historial) y se subió a un repositorio propio. En total: 5 issues de historias de usuario y 10 Pull Requests, todos fusionados en main.</w:t>
       </w:r>
     </w:p>
     <w:p>
@@ -7240,6 +7240,101 @@
           </w:p>
         </w:tc>
       </w:tr>
+      <w:tr>
+        <w:trPr>
+          <w:cantSplit/>
+        </w:trPr>
+        <w:tc>
+          <w:tcPr>
+            <w:tcW w:w="800" w:type="dxa"/>
+            <w:vAlign w:val="center"/>
+          </w:tcPr>
+          <w:p>
+            <w:pPr>
+              <w:spacing w:after="40" w:line="252" w:lineRule="auto"/>
+            </w:pPr>
+            <w:r>
+              <w:rPr>
+                <w:color w:val="000000"/>
+                <w:sz w:val="17"/>
+              </w:rPr>
+              <w:t>#16</w:t>
+            </w:r>
+          </w:p>
+        </w:tc>
+        <w:tc>
+          <w:tcPr>
+            <w:tcW w:w="3160" w:type="dxa"/>
+            <w:vAlign w:val="center"/>
+          </w:tcPr>
+          <w:p>
+            <w:pPr>
+              <w:spacing w:after="40" w:line="252" w:lineRule="auto"/>
+            </w:pPr>
+            <w:r>
+              <w:rPr>
+                <w:color w:val="000000"/>
+                <w:sz w:val="17"/>
+              </w:rPr>
+              <w:t>HU-02: limpia los horarios y el paso 3 al cambiar de mes</w:t>
+            </w:r>
+          </w:p>
+        </w:tc>
+        <w:tc>
+          <w:tcPr>
+            <w:tcW w:w="1800" w:type="dxa"/>
+            <w:vAlign w:val="center"/>
+          </w:tcPr>
+          <w:p>
+            <w:pPr>
+              <w:spacing w:after="40" w:line="252" w:lineRule="auto"/>
+            </w:pPr>
+            <w:r>
+              <w:rPr>
+                <w:color w:val="000000"/>
+                <w:sz w:val="17"/>
+              </w:rPr>
+              <w:t>Roy</w:t>
+            </w:r>
+          </w:p>
+        </w:tc>
+        <w:tc>
+          <w:tcPr>
+            <w:tcW w:w="1800" w:type="dxa"/>
+            <w:vAlign w:val="center"/>
+          </w:tcPr>
+          <w:p>
+            <w:pPr>
+              <w:spacing w:after="40" w:line="252" w:lineRule="auto"/>
+            </w:pPr>
+            <w:r>
+              <w:rPr>
+                <w:color w:val="000000"/>
+                <w:sz w:val="17"/>
+              </w:rPr>
+              <w:t>—</w:t>
+            </w:r>
+          </w:p>
+        </w:tc>
+        <w:tc>
+          <w:tcPr>
+            <w:tcW w:w="1800" w:type="dxa"/>
+            <w:vAlign w:val="center"/>
+          </w:tcPr>
+          <w:p>
+            <w:pPr>
+              <w:spacing w:after="40" w:line="252" w:lineRule="auto"/>
+            </w:pPr>
+            <w:r>
+              <w:rPr>
+                <w:color w:val="000000"/>
+                <w:sz w:val="17"/>
+              </w:rPr>
+              <w:t>Mejora derivada del QA de Kelvin; fusionado tras confirmar con el equipo.</w:t>
+            </w:r>
+          </w:p>
+        </w:tc>
+      </w:tr>
     </w:tbl>
     <w:tbl>
       <w:tblPr>
@@ -14744,11 +14839,10 @@
             </w:pPr>
             <w:r>
               <w:rPr>
-                <w:i w:val="0"/>
-                <w:color w:val="000000"/>
-                <w:sz w:val="17"/>
-              </w:rPr>
-              <w:t>☑ (5 de 9 PR con revisión registrada)</w:t>
+                <w:color w:val="000000"/>
+                <w:sz w:val="17"/>
+              </w:rPr>
+              <w:t>☑ (5 de 10 PR con revisión registrada)</w:t>
             </w:r>
           </w:p>
         </w:tc>

</xml_diff>